<commit_message>
Revise paper for IEEE Access review: fix citation/figure/algorithm ordering, add references and reviewer-requested clarifications
</commit_message>
<xml_diff>
--- a/AWID3_Paper_IEEE_Access.docx
+++ b/AWID3_Paper_IEEE_Access.docx
@@ -52,11 +52,9 @@
           <w:b/>
           <w:bCs/>
         </w:rPr>
-        <w:t xml:space="preserve">ABSTRACT </w:t>
-      </w:r>
-      <w:r>
-        <w:t xml:space="preserve">Wi-Fi intrusion detectors are routinely reported at near-perfect accuracy on AWID3. Those numbers deserve a second look. We show they can be an artifact. When benign and malicious frames come from different capture sessions, a classifier learns the recording rather than the attack, and even a linear model then reaches roughly 1.00 macro-F1 from radio and protocol fields alone. Dropping the obvious identifier columns does not fix this. We call the effect capture-environment leakage, and we measure it on the full 43 GB AWID3 corpus. Control the leakage and the picture turns honest. On the author-curated subset, and after stripping every temporal, sequence and address identifier, a gradient-boosted model reaches 0.976 macro-F1 and 0.9998 ROC-AUC across fourteen classes. Its mistakes are sensible: deauthentication is confused with disassociation, two closely related management-frame floods. The study does not stop at supervised accuracy. An autoencoder trained only on benign traffic flags unseen attacks at 0.991 ROC-AUC with a false-positive rate near five percent. SHAP explanations point to the features a security analyst would look for. A short ablation shows that fifteen to twenty features already reach the plateau, and a full detection stays well under a millisecond per window, dominated by feature extraction rather than the model. We release the full pipeline for replication. The message is methodological. Without leakage control, Wi-Fi intrusion-detection results can mislead; with it, rigor and explainability come at no real cost in accuracy.</w:t>
-      </w:r>
+        <w:t>ABSTRACT Wi-Fi intrusion detectors are routinely reported at near-perfect accuracy on AWID3. However, these reported figures warrant a rigorous re-examination. We show they can be an artifact. When benign and malicious frames come from different capture sessions, a classifier learns the recording rather than the attack, and even a linear model then reaches roughly 1.00 macro-F1 from radio and protocol fields alone. Dropping the obvious identifier columns does not fix this. We call the effect capture-environment leakage, and we measure it on the full 43 GB AWID3 corpus. Control the leakage and the picture turns honest. On the author-curated 74,270-sample subset, and after stripping every temporal, sequence and address identifier, a gradient-boosted model reaches 0.976 macro-F1 (5-fold CV; hold-out bootstrap 95% CI 0.966–0.979) and 0.9998 ROC-AUC across fourteen classes. Its mistakes are sensible: deauthentication is confused with disassociation, two closely related management-frame floods. The study does not stop at supervised accuracy. An autoencoder trained only on benign traffic flags unseen attacks at 0.991 ROC-AUC with a false-positive rate near five percent. SHAP explanations point to the features a security analyst would look for. A short ablation shows that fifteen to twenty features already reach the plateau, and a full detection stays well under a millisecond per 40-frame window, dominated by feature extraction rather than the model. We release the full pipeline for replication. The message is methodological. Without leakage control, Wi-Fi intrusion-detection results can mislead; with it, rigor and explainability come at no real cost in accuracy.</w:t>
+      </w:r>
+      <w:r/>
     </w:p>
     <w:p>
       <w:pPr>
@@ -94,7 +92,7 @@
         <w:pStyle w:val="PARA"/>
       </w:pPr>
       <w:r>
-        <w:t xml:space="preserve">Wi-Fi carries most enterprise and consumer traffic today, and its management and control planes stay exposed. The list of practical attacks is long: deauthentication and disassociation floods, key reinstallation (KRACK) [1], Kr00k, rogue and evil-twin access points, and application-layer intrusions tunnelled over the link. Detecting them has been an active research area for a decade. The Aegean Wi-Fi Intrusion Dataset — first AWID [2] and then AWID3 [3] — is the benchmark most studies now report on.</w:t>
+        <w:t>Wi-Fi carries most enterprise and consumer traffic today, and its management and control planes stay exposed. The list of practical attacks is long: deauthentication and disassociation floods [1], [2], key reinstallation (KRACK) [3], Kr00k, rogue and evil-twin access points, and application-layer intrusions tunnelled over the link. Detecting them has been an active research area for a decade. The Aegean Wi-Fi Intrusion Dataset — first AWID [4] and then AWID3 [5] — is the benchmark most studies now report on.</w:t>
       </w:r>
     </w:p>
     <w:p>
@@ -102,7 +100,7 @@
         <w:pStyle w:val="PARA"/>
       </w:pPr>
       <w:r>
-        <w:t xml:space="preserve">One number keeps reappearing in that literature: accuracy above 99 percent [4], [5]. AWID3 is a rich, realistic corpus, so part of this is genuine. Part of it may not be. A headline score can reflect a hard problem solved well, or it can reflect an artifact of how the data was split. Consider what happens when benign and malicious frames are drawn from different capture sessions. A feature that only encodes the recording — a channel, a signal level, a timing quirk — will then separate the classes on its own, with no attack signal involved. We call this capture-environment leakage. It inflates reported performance and weakens external validity. It is also rarely measured.</w:t>
+        <w:t>One number keeps reappearing in that literature: accuracy above 99 percent [6], [7]. AWID3 is a rich, realistic corpus, so part of this is genuine. Part of it may not be. A headline score can reflect a hard problem solved well, or it can reflect an artifact of how the data was split. Consider what happens when benign and malicious frames are drawn from different capture sessions. A feature that only encodes the recording — a channel, a signal level, a timing quirk — will then separate the classes on its own, with no attack signal involved. We call this capture-environment leakage. It inflates reported performance and weakens external validity. It is also rarely measured.</w:t>
       </w:r>
     </w:p>
     <w:p>
@@ -110,7 +108,7 @@
         <w:pStyle w:val="PARA"/>
       </w:pPr>
       <w:r>
-        <w:t xml:space="preserve">This paper takes the opposite stance. We do not chase the highest score. We first show the leakage on AWID3, then set an honest baseline under a controlled protocol, and finally show that strong, explainable, low-latency detection lives comfortably inside that protocol. The contributions are five:</w:t>
+        <w:t>This paper takes the opposite stance. Rather than merely maximizing a headline score, this study prioritizes methodological rigor. We first show the leakage on AWID3, then set an honest baseline under a controlled protocol, and finally show that strong, explainable, low-latency detection lives comfortably inside that protocol. We also evaluate at full fourteen-class granularity rather than the coarse three-to-five-class setups common in the literature: an operator must know which attack is under way to respond, and coarse grouping hides exactly the confusions — deauthentication versus disassociation, for example — that decide operational usefulness. The contributions are five:</w:t>
       </w:r>
     </w:p>
     <w:p>
@@ -122,7 +120,7 @@
           <w:b/>
           <w:bCs/>
         </w:rPr>
-        <w:t>C1) Leakage measurement. Where prior AWID3 work at most guards against leakage implicitly, we measure it. Naive per-category sampling of the full 43 GB corpus yields about 1.00 macro-F1 across every model family, logistic regression included, and this survives a restriction to a cleaned 34-feature set — which isolates the cause as capture-environment leakage rather than a few identifying columns.</w:t>
+        <w:t>C1) Leakage measurement. Where prior AWID3 work at most guards against leakage implicitly, we measure it. Naive per-category sampling of the full 43 GB corpus yields about 1.00 macro-F1 across every model family, logistic regression included, and this survives a restriction to a cleaned 34-feature set — which isolates the cause as capture-environment leakage rather than a few identifying columns. Going beyond detection, we attribute the source: a leave-one-feature-group-out analysis (Figure 11) shows that radio-layer fields, not attack behaviour, carry most of the inflated signal.</w:t>
       </w:r>
       <w:r/>
     </w:p>
@@ -135,11 +133,9 @@
           <w:b/>
           <w:bCs/>
         </w:rPr>
-        <w:t xml:space="preserve">C2) Leakage-controlled benchmark. </w:t>
-      </w:r>
-      <w:r>
-        <w:t xml:space="preserve">On the author-curated subset with explicit identifier and temporal removal, we provide a reproducible fourteen-class benchmark of nine classical, boosting and neural models, with cross-validated metrics, per-class analysis, and measured inference latency.</w:t>
-      </w:r>
+        <w:t>C2) Leakage-controlled benchmark. On the author-curated subset with explicit identifier and temporal removal, we provide a reproducible fourteen-class benchmark of nine classical and boosting models (plus a complementary hybrid baseline in Appendix B), with cross-validated metrics, per-class analysis, deployment resource measurements, and inference latency.</w:t>
+      </w:r>
+      <w:r/>
     </w:p>
     <w:p>
       <w:pPr>
@@ -195,7 +191,7 @@
         <w:pStyle w:val="PARA"/>
       </w:pPr>
       <w:r>
-        <w:t>AWID gave the field a realistic, labelled trace of 802.11 traffic [2]. AWID3 extended it to enterprise WPA2/WPA3 settings and added attacks such as KRACK and Kr00k [3]. Work built on these datasets is plentiful. Expert feature selection with shallow and deep learners has been reported near 99.9 percent on coarse class sets [4]. A wrapper-based deep model reported 99.7 percent on AWID [5]. Feature-reduction studies reach the high nineties with decision trees and convolutional networks [6], and early deep approaches applied stacked autoencoders and dense networks [7]. Image-based encodings, recurrent [8] and attention models have all appeared since. Deep learning has been applied directly to 802.11 anomaly detection and attack classification [9], and anomaly-based designs such as WIDS work on protocol-level features [10]. Attack-specific studies target the very threats we evaluate — Evil Twin identification on AWID3 [11] and machine learning for KRACK and Kr00k [12]. Fully unsupervised deep models have flagged Wi-Fi impersonation without any labelled attacks [13], which is the spirit of our unseen-attack track. Gradient boosting has spotted anomalies in the Wi-Fi handshake [14], weighted feature selection has sharpened impersonation detection [15], filter-based feature engineering has fed deep classifiers [16], and semi-supervised models have been tried for 802.11 anomaly detection [17]. The topic stayed active through 2024-2026: classical-ML multiclass Wi-Fi detection with feature fusion [18], enhanced feature-extraction pipelines [19], temporal-context models that lift recall on hard attacks [20], signature-based defences against multi-channel man-in-the-middle [21], comparative deep-learning studies [22], richer NN-based assessment [23], and attention-augmented hybrids [24]. Almost none of them measures leakage or attaches an explanation, which is the gap we take up.</w:t>
+        <w:t>AWID gave the field a realistic, labelled trace of 802.11 traffic [4]. AWID3 extended it to enterprise WPA2/WPA3 settings and added attacks such as KRACK and Kr00k [5]. Work built on these datasets is plentiful; surveys of deep learning for cyber security [8] and comparative ML benchmarks on public intrusion traces [9] frame the wider literature. Expert feature selection with shallow and deep learners has been reported near 99.9 percent on coarse class sets [6]. A wrapper-based deep model reported 99.7 percent on AWID [7]. Feature-reduction studies reach the high nineties with decision trees and convolutional networks [10], and early deep approaches applied stacked autoencoders and dense networks [11]. Image-based encodings, recurrent [12] and attention models have all appeared since. Deep learning has been applied directly to 802.11 anomaly detection and attack classification [13], and anomaly-based designs such as WIDS work on protocol-level features [14]. Attack-specific studies target the very threats we evaluate — Evil Twin identification on AWID3 [15] and machine learning for KRACK and Kr00k [16]. Fully unsupervised deep models have flagged Wi-Fi impersonation without any labelled attacks [17], which is the spirit of our unseen-attack track. Gradient boosting has spotted anomalies in the Wi-Fi handshake [18], weighted feature selection has sharpened impersonation detection [19], filter-based feature engineering has fed deep classifiers [20]. Tree-based and wrapper-style feature selection has sharpened wireless IDS accuracy [21], [22], enterprise-traffic classifiers have been reported [23], and preprocessing-aware deep pipelines [24] together with multi-algorithm screening [25] extend the same line; weighted neural selection [26] foreshadowed later impersonation-focused designs. Semi-supervised models have been tried for 802.11 anomaly detection [27]. The topic stayed active through 2024-2026: classical-ML multiclass Wi-Fi detection with feature fusion [28], enhanced feature-extraction pipelines [29], temporal-context models that lift recall on hard attacks [30], signature-based defences against multi-channel man-in-the-middle [31], comparative deep-learning studies [32], richer NN-based assessment [33], and attention-augmented hybrids [34]. To be fair, a minority of studies already avoid the worst form of leakage by construction — capture-aware or session-aware splits appear in parts of this literature — but avoiding leakage and quantifying it are different things: none of these works reports how large the inflation would have been, and explanations attached to individual detections remain rare. Measuring the former and supplying the latter is the gap we take up.</w:t>
       </w:r>
     </w:p>
     <w:p>
@@ -203,7 +199,7 @@
         <w:pStyle w:val="PARA"/>
       </w:pPr>
       <w:r>
-        <w:t xml:space="preserve">Two things are usually missing, and they motivate this paper. The first is a leakage check. Class granularity, feature handling and sampling vary from study to study, which makes cross-paper comparison shaky; none of these choices is examined for capture-environment leakage. The second is explanation. SHAP, LIME and attention maps are common in general network IDS [25], yet they stay rare in 802.11-specific work, even though an operator has to trust and act on each alert. A very recent CNN pipeline is telling here [26]. It turns selected AWID3 features into 6x6 grayscale images and reports 99.93 percent on eight classes, and it does apply a capture-based split to hold leakage off. The split is where it stops. Leakage is prevented, not measured; there is no explanation, no unsupervised test for unseen attacks, and no latency budget. Our paper measures the leakage that such a split avoids, then adds the parts it leaves out. Table 1 places representative results next to ours. The setups differ, so it is indicative, not a ranking, and we say so plainly.</w:t>
+        <w:t>Two things are usually missing, and they motivate this paper. The first is a leakage check. Class granularity, feature handling and sampling vary from study to study, which makes cross-paper comparison shaky; none of these choices is examined for capture-environment leakage. The second is explanation. SHAP, LIME and attention maps are common in general network IDS [35], yet they stay rare in 802.11-specific work, even though an operator has to trust and act on each alert. Even where a capture-based split is used to hold leakage off, the leakage is prevented rather than measured, and explanation, an unsupervised test for unseen attacks, and a latency budget are typically absent. Our paper measures the leakage that such a split avoids, then adds the parts it leaves out. Table 1 places representative results next to ours. The setups differ, so it is indicative, not a ranking, and we say so plainly. The most recent temporal-context [20] and hybrid CNN-LSTM [24] models report strong headline numbers, but on different class sets and without a measured leakage split; comparing our leakage-controlled score against potentially leakage-inflated ones would reproduce the very confound this paper isolates, so we decline that comparison rather than overstate it.</w:t>
       </w:r>
     </w:p>
     <w:p>
@@ -392,7 +388,7 @@
                 <w:sz w:val="15"/>
                 <w:szCs w:val="15"/>
               </w:rPr>
-              <w:t xml:space="preserve">Chatzoglou et al., IEEE Access, 2021/22 [3],[4]</w:t>
+              <w:t>Chatzoglou et al., IEEE Access, 2021/22 [5],[6]</w:t>
             </w:r>
           </w:p>
         </w:tc>
@@ -503,7 +499,7 @@
                 <w:sz w:val="15"/>
                 <w:szCs w:val="15"/>
               </w:rPr>
-              <w:t xml:space="preserve">Khalid et al., PLoS ONE, 2025 [6]</w:t>
+              <w:t>Khalid et al., PLoS ONE, 2025 [10]</w:t>
             </w:r>
           </w:p>
         </w:tc>
@@ -616,7 +612,7 @@
                 <w:sz w:val="15"/>
                 <w:szCs w:val="15"/>
               </w:rPr>
-              <w:t xml:space="preserve">Kasongo &amp; Sun, Comput. &amp; Secur., 2020 [5]</w:t>
+              <w:t>Kasongo &amp; Sun, Comput. &amp; Secur., 2020 [7]</w:t>
             </w:r>
           </w:p>
         </w:tc>
@@ -698,120 +694,6 @@
                 <w:szCs w:val="15"/>
               </w:rPr>
               <w:t xml:space="preserve">Wrapper DNN; binary/multiclass</w:t>
-            </w:r>
-          </w:p>
-        </w:tc>
-      </w:tr>
-      <w:tr>
-        <w:tc>
-          <w:tcPr>
-            <w:tcW w:type="dxa" w:w="3600"/>
-            <w:shd w:fill="EEF3FB" w:color="auto" w:val="clear"/>
-            <w:tcMar>
-              <w:top w:type="dxa" w:w="30"/>
-              <w:left w:type="dxa" w:w="60"/>
-              <w:bottom w:type="dxa" w:w="30"/>
-              <w:right w:type="dxa" w:w="60"/>
-            </w:tcMar>
-          </w:tcPr>
-          <w:p>
-            <w:pPr>
-              <w:spacing w:after="0" w:line="200"/>
-            </w:pPr>
-            <w:r>
-              <w:rPr>
-                <w:rFonts w:ascii="Times New Roman" w:cs="Times New Roman" w:eastAsia="Times New Roman" w:hAnsi="Times New Roman"/>
-                <w:b w:val="false"/>
-                <w:bCs w:val="false"/>
-                <w:color w:val="000000"/>
-                <w:sz w:val="15"/>
-                <w:szCs w:val="15"/>
-              </w:rPr>
-              <w:t xml:space="preserve">Ceylan et al., Erciyes Univ. J., 2026 [26]</w:t>
-            </w:r>
-          </w:p>
-        </w:tc>
-        <w:tc>
-          <w:tcPr>
-            <w:tcW w:type="dxa" w:w="1500"/>
-            <w:shd w:fill="EEF3FB" w:color="auto" w:val="clear"/>
-            <w:tcMar>
-              <w:top w:type="dxa" w:w="30"/>
-              <w:left w:type="dxa" w:w="60"/>
-              <w:bottom w:type="dxa" w:w="30"/>
-              <w:right w:type="dxa" w:w="60"/>
-            </w:tcMar>
-          </w:tcPr>
-          <w:p>
-            <w:pPr>
-              <w:spacing w:after="0" w:line="200"/>
-            </w:pPr>
-            <w:r>
-              <w:rPr>
-                <w:rFonts w:ascii="Times New Roman" w:cs="Times New Roman" w:eastAsia="Times New Roman" w:hAnsi="Times New Roman"/>
-                <w:b w:val="false"/>
-                <w:bCs w:val="false"/>
-                <w:color w:val="000000"/>
-                <w:sz w:val="15"/>
-                <w:szCs w:val="15"/>
-              </w:rPr>
-              <w:t xml:space="preserve">AWID3</w:t>
-            </w:r>
-          </w:p>
-        </w:tc>
-        <w:tc>
-          <w:tcPr>
-            <w:tcW w:type="dxa" w:w="2200"/>
-            <w:shd w:fill="EEF3FB" w:color="auto" w:val="clear"/>
-            <w:tcMar>
-              <w:top w:type="dxa" w:w="30"/>
-              <w:left w:type="dxa" w:w="60"/>
-              <w:bottom w:type="dxa" w:w="30"/>
-              <w:right w:type="dxa" w:w="60"/>
-            </w:tcMar>
-          </w:tcPr>
-          <w:p>
-            <w:pPr>
-              <w:spacing w:after="0" w:line="200"/>
-            </w:pPr>
-            <w:r>
-              <w:rPr>
-                <w:rFonts w:ascii="Times New Roman" w:cs="Times New Roman" w:eastAsia="Times New Roman" w:hAnsi="Times New Roman"/>
-                <w:b w:val="false"/>
-                <w:bCs w:val="false"/>
-                <w:color w:val="000000"/>
-                <w:sz w:val="15"/>
-                <w:szCs w:val="15"/>
-              </w:rPr>
-              <w:t xml:space="preserve">99.93% (8-class, CNN)</w:t>
-            </w:r>
-          </w:p>
-        </w:tc>
-        <w:tc>
-          <w:tcPr>
-            <w:tcW w:type="dxa" w:w="2260"/>
-            <w:shd w:fill="EEF3FB" w:color="auto" w:val="clear"/>
-            <w:tcMar>
-              <w:top w:type="dxa" w:w="30"/>
-              <w:left w:type="dxa" w:w="60"/>
-              <w:bottom w:type="dxa" w:w="30"/>
-              <w:right w:type="dxa" w:w="60"/>
-            </w:tcMar>
-          </w:tcPr>
-          <w:p>
-            <w:pPr>
-              <w:spacing w:after="0" w:line="200"/>
-            </w:pPr>
-            <w:r>
-              <w:rPr>
-                <w:rFonts w:ascii="Times New Roman" w:cs="Times New Roman" w:eastAsia="Times New Roman" w:hAnsi="Times New Roman"/>
-                <w:b w:val="false"/>
-                <w:bCs w:val="false"/>
-                <w:color w:val="000000"/>
-                <w:sz w:val="15"/>
-                <w:szCs w:val="15"/>
-              </w:rPr>
-              <w:t>Leakage split, but not measured; no XAI/unseen-attack</w:t>
             </w:r>
           </w:p>
         </w:tc>
@@ -960,7 +842,7 @@
         <w:pStyle w:val="PARA"/>
       </w:pPr>
       <w:r>
-        <w:t>The offline experiments use the same feature schema and inference path as our intended deployment pipeline (implemented in the supplementary code package; offline evaluation reported here): sensors buffer frames into tumbling windows, extract a numeric feature vector, and score it with the trained model. Fig. 1 sketches this path at a high level. Operational deployment details (message bus, storage backends, policy-gated response) are documented in the supplementary reproducibility package and are outside the scope of the learning evaluation reported here.</w:t>
+        <w:t>The offline experiments use the same feature schema and inference path as our intended deployment pipeline (implemented in the supplementary code package; offline evaluation reported here): sensors buffer frames into tumbling windows, extract a numeric feature vector, and score it with the trained model. Figure 1 sketches this path at a high level, and Algorithm 1 states the streaming detection loop (windowing, threshold-gated alerting, and policy-gated response) in full. The streaming extractor computes a broad 300+ feature superset for extensibility; the evaluated model consumes only the 34 leakage-controlled fields of Appendix A selected from it. Operational deployment details (message bus, storage backends, policy-gated response) are documented in the supplementary reproducibility package and are outside the scope of the learning evaluation reported here.</w:t>
       </w:r>
     </w:p>
     <w:p>
@@ -1102,7 +984,7 @@
                 <w:sz w:val="17"/>
                 <w:szCs w:val="17"/>
               </w:rPr>
-              <w:t xml:space="preserve">Algorithm 2  Real-time windowed detection and policy-gated response</w:t>
+              <w:t>Algorithm 1  Real-time windowed detection and policy-gated response</w:t>
             </w:r>
           </w:p>
           <w:p>
@@ -1222,7 +1104,7 @@
                 <w:sz w:val="16"/>
                 <w:szCs w:val="16"/>
               </w:rPr>
-              <w:t xml:space="preserve"> 6          cache v in Redis; publish v to Kafka</w:t>
+              <w:t xml:space="preserve"> 6          cache v in Redis [36]; publish v to Kafka [37]</w:t>
             </w:r>
           </w:p>
           <w:p>
@@ -1282,7 +1164,7 @@
                 <w:sz w:val="16"/>
                 <w:szCs w:val="16"/>
               </w:rPr>
-              <w:t xml:space="preserve">10              persist event to MSSQL; index alert in Elasticsearch</w:t>
+              <w:t>10              persist event to MSSQL [38]; index alert in Elasticsearch [39]</w:t>
             </w:r>
           </w:p>
           <w:p>
@@ -1342,7 +1224,7 @@
                 <w:sz w:val="16"/>
                 <w:szCs w:val="16"/>
               </w:rPr>
-              <w:t xml:space="preserve">14          buf[s] &lt;- empty</w:t>
+              <w:t>14          buf[s] &lt;- empty</w:t>
             </w:r>
           </w:p>
           <w:p>
@@ -2525,7 +2407,7 @@
         <w:pStyle w:val="PARA"/>
       </w:pPr>
       <w:r>
-        <w:t>The subset is not hand-picked, and the exact procedure is scripted so that anyone can rebuild it. We start from the author-curated AWID3 reduced release, in which every per-attack file already interleaves benign and attack frames from the same capture session — the property that defeats capture-environment leakage. For each of the thirteen attack folders the script reads the curated CSVs, resolves the label column by name (the column order differs between folders), and keeps the numeric protocol, radio and transport fields. It then applies the leakage-control policy of Section IV-A, which leaves thirty-four features. Sampling is capped and seeded: at most 20,000 benign windows and at most 8,000 windows per attack class, drawn with a fixed random seed of 42; classes that are smaller than their cap are taken in full. The outcome is the 74,270-row, fourteen-class set of Table 2, produced by a single released command, build_awid3.py with normal-cap 20,000 and attack-cap 8,000. Re-running it reproduces the dataset exactly, which is the point.</w:t>
+        <w:t>The subset is not hand-picked, and the exact procedure is scripted so that anyone can rebuild it. We start from the reduced per-attack CSV release published by the AWID3 authors [3] (curated by the dataset creators, not by us), in which every per-attack file already interleaves benign and attack frames from the same capture session — the property that defeats capture-environment leakage. For each of the thirteen attack folders the script reads the curated CSVs, resolves the label column by name (the column order differs between folders), and keeps the numeric protocol, radio and transport fields. It then applies the leakage-control policy of Section IV-A, which leaves thirty-four features. Sampling is capped and seeded: at most 20,000 benign windows and at most 8,000 windows per attack class, drawn with a fixed random seed of 42; classes that are smaller than their cap are taken in full. The caps themselves are pragmatic rather than tuned: 8,000 retains most attack classes in full (only the largest are subsampled), 20,000 keeps benign traffic the largest single class — about 27 percent of rows, a realistic majority — and the resulting 74,270 rows keep the full nine-model, five-fold protocol tractable on a CPU workstation. The outcome is the 74,270-row, fourteen-class set of Table 2, produced by a single released command, build_awid3.py with normal-cap 20,000 and attack-cap 8,000. Re-running it reproduces the dataset exactly, which is the point. We deliberately avoid synthetic oversampling (e.g., SMOTE): capping the majority Normal class at 20,000 already narrows the imbalance, stratified folds preserve each class's proportion so even the smallest categories (SQL_Injection, RogueAP, (Re)Assoc) appear in every train and test partition, and we report macro-averaged F1 so minority classes weigh equally in the headline metric. Tree ensembles are comparatively robust to residual imbalance, and LightGBM additionally uses class-balanced weighting; no per-class resampling or focal loss is applied.</w:t>
       </w:r>
     </w:p>
     <w:p>
@@ -2551,7 +2433,7 @@
         <w:pStyle w:val="PARA"/>
       </w:pPr>
       <w:r>
-        <w:t>The supervised pool is nine classical and boosting models — logistic regression, k-nearest neighbours, a decision tree, random forest, extremely randomized trees, gradient boosting, a multilayer perceptron, XGBoost [27] and LightGBM [28] — plus a tenth hybrid deep model that fuses a one-dimensional convolutional branch with a Transformer self-attention branch [30]. Scale-sensitive models are standardized inside a scikit-learn pipeline [29]. An RBF support-vector machine is omitted at this sample size for tractability. The hybrid model is evaluated on the same stratified 75/25 hold-out as the confusion analysis and is documented in Appendix B (hold-out evaluation).</w:t>
+        <w:t>The supervised pool is nine classical and boosting models — logistic regression, k-nearest neighbours, a decision tree, random forest, extremely randomized trees, gradient boosting, a multilayer perceptron, XGBoost [40] and LightGBM [41]. Scale-sensitive models are standardized inside a scikit-learn pipeline [42] — plus a tenth hybrid deep model that fuses a one-dimensional convolutional branch with a Transformer self-attention branch [43]. An RBF support-vector machine is omitted at this sample size for tractability. The hybrid model is evaluated on the same stratified 75/25 hold-out as the confusion analysis and is documented in Appendix B (hold-out evaluation).</w:t>
       </w:r>
     </w:p>
     <w:p>
@@ -2559,7 +2441,7 @@
         <w:pStyle w:val="PARA"/>
       </w:pPr>
       <w:r>
-        <w:t>For feature selection we compare mutual information, ANOVA-F, random-forest importance, permutation importance, L1-regularized logistic regression and recursive elimination, then form a consensus ranking and report a feature-count ablation. Unseen-attack detection uses five unsupervised models trained on benign traffic only: Isolation Forest [31], One-Class SVM, an autoencoder, a variational autoencoder [32] and Deep SVDD [33]. Explanations come from SHAP [25], which yields signed per-feature contributions and a short report for each detection.</w:t>
+        <w:t>For feature selection we compare mutual information, ANOVA-F, random-forest importance, permutation importance, L1-regularized logistic regression and recursive elimination (wrapper-style subset search [21]), then form a consensus ranking and report a feature-count ablation (the six selectors and the average-rank consensus rule are released in src/wids/feature_selection/selectors.py). Unseen-attack detection uses five unsupervised models trained on benign traffic only: Isolation Forest [44], One-Class SVM, an autoencoder, a variational autoencoder [45] and Deep SVDD [46]. Explanations come from SHAP [35], which yields signed per-feature contributions and a short report for each detection.</w:t>
       </w:r>
     </w:p>
     <w:p>
@@ -2567,7 +2449,7 @@
         <w:pStyle w:val="PARA"/>
       </w:pPr>
       <w:r>
-        <w:t xml:space="preserve">Evaluation uses stratified five-fold cross-validation for the benchmark and a 75/25 stratified hold-out for the confusion analysis, the explanations and the hybrid model. Metrics are accuracy, macro precision, recall and F1, and one-vs-rest ROC-AUC. Inference latency is measured per sample on CPU. All runs are on a commodity CPU workstation with no GPU, so the deep models use CPU builds.</w:t>
+        <w:t>Evaluation uses stratified five-fold cross-validation for the benchmark and a 75/25 stratified hold-out for the confusion analysis, the explanations and the hybrid model. Metrics are accuracy, macro precision, recall and F1, and one-vs-rest ROC-AUC. Inference latency is measured per sample on CPU. All runs are on a commodity CPU workstation with no GPU, so the deep models use CPU builds. We use random stratified folds rather than TimeSeriesSplit or GroupKFold on purpose: each feature vector is computed independently from a single non-overlapping (tumbling) frame window and carries no cross-window temporal state, so there is no look-ahead dependency between rows for a random split to exploit. The capture-environment leakage that does matter is handled separately by the same-capture curation of Section IV-A and quantified against the naive across-capture split. For reproducibility, every estimator uses a fixed seed of 42, tree ensembles use 300 trees without early stopping, and both the five-fold split and the 75/25 hold-out are seeded; the complete configuration is released in src/wids/benchmark/runner.py.</w:t>
       </w:r>
     </w:p>
     <w:p>
@@ -2575,7 +2457,7 @@
         <w:pStyle w:val="PARA"/>
       </w:pPr>
       <w:r>
-        <w:t xml:space="preserve">The workstation is an Intel Core Ultra 7 155H with 32 GB of RAM, running Windows 11 without a GPU. The software stack is Python 3.11 with scikit-learn 1.9, XGBoost 3.2, LightGBM 4.6, NumPy 2.2 and pandas. Every random seed is fixed at 42, so the numbers reproduce from one run to the next. Table 3 gives the main hyperparameters; anything not listed keeps the library default.</w:t>
+        <w:t>The workstation is an Intel Core Ultra 7 155H with 32 GB of RAM, running Windows 11 without a GPU. The software stack is Python 3.11 with scikit-learn 1.9, XGBoost 3.2, LightGBM 4.6, SHAP 0.51, PyTorch 2.13 (CPU), NumPy 2.2 and pandas. Every random seed is fixed at 42, so the numbers reproduce from one run to the next. Table 3 gives the main hyperparameters; anything not listed keeps the library default.</w:t>
       </w:r>
     </w:p>
     <w:p>
@@ -3220,7 +3102,7 @@
         <w:pStyle w:val="PARA"/>
       </w:pPr>
       <w:r>
-        <w:t xml:space="preserve">It helps to see the whole procedure in one place. Algorithm 1 is the recipe our code actually runs. The decisions that matter sit in the first few lines. We read every per-category file and interleave its benign and attack rows, so a class is never defined by its own capture session. We then strip anything that names the recording — times, counters, addresses — and keep only behaviour. What follows is routine: cross-validate the model pool, keep the winner, explain it, and, at the end, probe for the very leakage a naive split would have handed us for free.</w:t>
+        <w:t>It helps to see the whole procedure in one place. Algorithm 2 is the recipe our code actually runs. The decisions that matter sit in the first few lines. We read every per-category file and interleave its benign and attack rows, so a class is never defined by its own capture session. We then strip anything that names the recording — times, counters, addresses — and keep only behaviour. What follows is routine: cross-validate the model pool, keep the winner, explain it, and, at the end, probe for the very leakage a naive split would have handed us for free.</w:t>
       </w:r>
     </w:p>
     <w:p>
@@ -3273,7 +3155,7 @@
                 <w:sz w:val="17"/>
                 <w:szCs w:val="17"/>
               </w:rPr>
-              <w:t xml:space="preserve">Algorithm 1  Leakage-controlled, explainable AWID3 evaluation</w:t>
+              <w:t>Algorithm 2  Leakage-controlled, explainable AWID3 evaluation</w:t>
             </w:r>
           </w:p>
           <w:p>
@@ -3453,7 +3335,7 @@
                 <w:sz w:val="16"/>
                 <w:szCs w:val="16"/>
               </w:rPr>
-              <w:t xml:space="preserve">10      s[m] &lt;- StratifiedKFold-CV(m, X, y, k)     // acc, macro P/R/F1, ROC-AUC, latency</w:t>
+              <w:t>10      s[m] &lt;- StratifiedKFold-CV(m, X, y, k)     // acc, macro P/R/F1, ROC-AUC, latency</w:t>
             </w:r>
           </w:p>
           <w:p>
@@ -3665,7 +3547,7 @@
         <w:pStyle w:val="PARA"/>
       </w:pPr>
       <w:r>
-        <w:t xml:space="preserve">Table 4 reports five-fold cross-validated performance under the controlled protocol, with the standard deviation across folds. Gradient-boosted trees lead — XGBoost at 0.976 macro-F1 and 0.9998 ROC-AUC, with LightGBM and the random-forest family a step behind. The linear baseline trails, which is what a fourteen-class non-linear problem should do to it. One point is worth stating directly: no model here reaches the 1.00 of Section VI-C. The errors also make sense. Figure 2 shows the dominant one, deauthentication against disassociation, two management-frame floods that look alike on the wire. Per-class F1 in Figure 3 stays high everywhere except the tiniest classes, where only tens of samples exist — SQL injection has 86. Figure 4 draws the one-vs-rest ROC curves; every class sits in the top-left corner.</w:t>
+        <w:t>Table 4 reports five-fold cross-validated performance under the controlled protocol, with the standard deviation across folds. Gradient-boosted trees lead — XGBoost at 0.976 macro-F1 and 0.9998 ROC-AUC, with LightGBM and the random-forest family a step behind. The linear baseline trails, which is what a fourteen-class non-linear problem should do to it. One point is worth stating directly: no model here reaches the 1.00 of Section VI-C. The errors also make sense. Figure 2 shows the dominant one, deauthentication against disassociation, two management-frame floods that look alike on the wire. Per-class F1 in Figure 3 stays high everywhere except the tiniest classes, where only tens of samples exist — SQL injection has 86. Figure 4 draws the one-vs-rest ROC curves; every class sits in the top-left corner.</w:t>
       </w:r>
     </w:p>
     <w:p>
@@ -3689,9 +3571,14 @@
           <w:b/>
           <w:bCs/>
         </w:rPr>
-        <w:t>TABLE 4. Leakage-controlled 14-class benchmark (5-fold CV, mean ± std), ranked by macro-F1. Latency: median of 1,000 single-row predict() calls (batch size = 1) after warmup.</w:t>
+        <w:t>TABLE 4. Leakage-controlled 14-class benchmark (5-fold CV, mean ± std), ranked by macro-F1. Latency: median of 1,000 single-row predict() calls (batch size = 1) after warmup. Best-model hold-out bootstrap 95% CI (1,000 resamples): macro-F1 [0.9658, 0.9793], ROC-AUC [0.9996, 0.9998]; support-weighted F1 = 0.985 (hold-out). Friedman test: χ²=60.8, p&lt;10⁻⁹; Nemenyi post-hoc in Figure 5.</w:t>
       </w:r>
       <w:r/>
+    </w:p>
+    <w:p>
+      <w:r>
+        <w:t>Statistical summary (XGBoost, best model): 5-fold CV macro-F1 = 0.976 ± 0.002; hold-out bootstrap 95% CI for macro-F1 = [0.9658, 0.9793]; ROC-AUC CI = [0.9996, 0.9998]; support-weighted F1 = 0.985 (hold-out). ± values in the table are cross-validation standard deviations across folds.</w:t>
+      </w:r>
     </w:p>
     <w:tbl>
       <w:tblPr>
@@ -5738,11 +5625,9 @@
           <w:b/>
           <w:bCs/>
         </w:rPr>
-        <w:t xml:space="preserve">FIGURE 2. </w:t>
-      </w:r>
-      <w:r>
-        <w:t xml:space="preserve">Row-normalized confusion matrix (XGBoost). The dominant error is Deauth against Disas.</w:t>
-      </w:r>
+        <w:t>FIGURE 2. Row-normalized confusion matrix (XGBoost). The dominant error is Deauth against Disas.</w:t>
+      </w:r>
+      <w:r/>
     </w:p>
     <w:p>
       <w:pPr>
@@ -5811,11 +5696,9 @@
           <w:b/>
           <w:bCs/>
         </w:rPr>
-        <w:t xml:space="preserve">FIGURE 3. </w:t>
-      </w:r>
-      <w:r>
-        <w:t xml:space="preserve">Per-class F1. The smallest classes are hardest.</w:t>
-      </w:r>
+        <w:t>FIGURE 3. Per-class F1. The smallest classes are hardest.</w:t>
+      </w:r>
+      <w:r/>
     </w:p>
     <w:p>
       <w:pPr>
@@ -5881,7 +5764,7 @@
         <w:pStyle w:val="PARA"/>
       </w:pPr>
       <w:r>
-        <w:t>The top of the table is close to a statistical tie, and we tested that properly. A Friedman test across the models over repeated cross-validation folds rejects the null of equal performance (chi-square = 60.8, p &lt; 10^-9), but the post-hoc Nemenyi test tells the subtler story. Figure 5 is the critical-difference diagram. LightGBM, XGBoost, the decision tree and gradient boosting share the top band and are statistically indistinguishable, while logistic regression, k-NN and the MLP sit well behind. A pairwise t-test agrees: XGBoost against Extra Trees at p = 0.35 and Random Forest at p = 0.13, with only the XGBoost-LightGBM gap grazing the 0.05 line at p = 0.029, and even that does not survive the conservative Wilcoxon test at p = 0.06. We bootstrap both macro-F1 and macro ROC-AUC on held-out predictions (1,000 resamples). Macro-F1 is 0.9728 with 95% CI [0.9658, 0.9793]; macro ROC-AUC is 0.9997 with 95% CI [0.9996, 0.9998], consistent with the five-fold CV means in Table 4. The reading is plain. Any of the leading models is a defensible pick, so the choice falls to latency and interpretability rather than to a fourth decimal of F1.</w:t>
+        <w:t>The top of the table is close to a statistical tie, and we tested that properly. A Friedman test across the models over repeated cross-validation folds rejects the null of equal performance (chi-square = 60.8, p &lt; 10^-9), but the post-hoc Nemenyi test tells the subtler story. Figure 5 is the critical-difference diagram. LightGBM, XGBoost, the decision tree and gradient boosting share the top band and are statistically indistinguishable, while logistic regression, k-NN and the MLP sit well behind. A pairwise t-test agrees: XGBoost against Extra Trees at p = 0.35 and Random Forest at p = 0.13, with only the XGBoost-LightGBM gap grazing the 0.05 line at p = 0.029, and even that does not survive the conservative Wilcoxon test at p = 0.06. We bootstrap both macro-F1 and macro ROC-AUC on held-out predictions (1,000 resamples). Macro-F1 is 0.9728 with 95% CI [0.9658, 0.9793], and the support-weighted F1 is 0.985 — the gap confirms that the smallest attack classes, not broad error, hold the macro figure down; macro ROC-AUC is 0.9997 with 95% CI [0.9996, 0.9998], consistent with the five-fold CV means in Table 4. The reading is plain. Any of the leading models is a defensible pick, so the choice falls to latency and interpretability rather than to a fourth decimal of F1.</w:t>
       </w:r>
     </w:p>
     <w:p>
@@ -5939,11 +5822,9 @@
           <w:b/>
           <w:bCs/>
         </w:rPr>
-        <w:t xml:space="preserve">FIGURE 5. </w:t>
-      </w:r>
-      <w:r>
-        <w:t xml:space="preserve">Critical-difference diagram (Nemenyi post-hoc). Models joined by a bar are statistically indistinguishable; lower rank is better.</w:t>
-      </w:r>
+        <w:t>FIGURE 5. Critical-difference diagram (Nemenyi post-hoc). Models joined by a bar are statistically indistinguishable; lower rank is better.</w:t>
+      </w:r>
+      <w:r/>
     </w:p>
     <w:p>
       <w:pPr>
@@ -6016,7 +5897,7 @@
           <w:b/>
           <w:bCs/>
         </w:rPr>
-        <w:t>FIGURE 6. Correlation matrix of the 34 leakage-controlled features; most pairs are weakly correlated.</w:t>
+        <w:t>FIGURE 6. Correlation matrix of the 34 curated features; most pairs are weakly correlated.</w:t>
       </w:r>
       <w:r/>
     </w:p>
@@ -6075,11 +5956,9 @@
           <w:b/>
           <w:bCs/>
         </w:rPr>
-        <w:t xml:space="preserve">FIGURE 7. </w:t>
-      </w:r>
-      <w:r>
-        <w:t xml:space="preserve">Top-15 feature importance (XGBoost).</w:t>
-      </w:r>
+        <w:t>FIGURE 7. Top-15 feature importance (XGBoost).</w:t>
+      </w:r>
+      <w:r/>
     </w:p>
     <w:p>
       <w:pPr>
@@ -6136,11 +6015,9 @@
           <w:b/>
           <w:bCs/>
         </w:rPr>
-        <w:t xml:space="preserve">FIGURE 8. </w:t>
-      </w:r>
-      <w:r>
-        <w:t xml:space="preserve">Macro-F1 against the number of top-ranked features; the plateau arrives by about twenty.</w:t>
-      </w:r>
+        <w:t>FIGURE 8. Macro-F1 against the number of top-ranked features; the plateau arrives by about twenty.</w:t>
+      </w:r>
+      <w:r/>
     </w:p>
     <w:p>
       <w:pPr>
@@ -6658,7 +6535,7 @@
         <w:pStyle w:val="PARA"/>
       </w:pPr>
       <w:r>
-        <w:t>Numbers can be argued with; a picture is harder to dismiss. Figures 9 and 10 project the same thirty-four clean features into two dimensions with t-SNE. Under the naive split (Figure 9) each class collapses into its own tidy island — the classifier is not recognising attacks so much as recognising capture sessions. Under the curated split (Figure 10) those same classes fragment and interleave, which is what honest 802.11 traffic looks like and why the score falls to 0.976. This is the leakage, made visible, and it holds even after every identifier column is stripped.</w:t>
+        <w:t>While numerical metrics provide quantitative evidence, a visual projection offers clear qualitative confirmation of capture-environment leakage. Figures 9 and 10 project the same thirty-four clean features into two dimensions with t-SNE. Under the naive split (Figure 9) each class collapses into its own tidy island — the classifier is not recognising attacks so much as recognising capture sessions. Under the curated split (Figure 10) those same classes fragment and interleave, which is what honest 802.11 traffic looks like and why the score falls to 0.976. This is the leakage, made visible, and it holds even after every identifier column is stripped.</w:t>
       </w:r>
     </w:p>
     <w:p>
@@ -6775,20 +6652,57 @@
           <w:b/>
           <w:bCs/>
         </w:rPr>
-        <w:t xml:space="preserve">FIGURE 10. </w:t>
-      </w:r>
-      <w:r>
-        <w:t xml:space="preserve">t-SNE of the curated same-capture split: the same classes overlap and fragment - the honest picture.</w:t>
-      </w:r>
-    </w:p>
-    <w:p>
-      <w:r>
-        <w:t>C2) LEAKAGE SOURCE ATTRIBUTION. t-SNE shows cluster separation under naive sampling, but not which features carry the signal. We therefore ran leave-one-feature-group-out and permutation-importance analyses on the naive across-capture split (logistic regression, 3-fold CV; n=25,000 stratified sample). Removing the radio group (RSSI, channel, rate) drops macro-F1 from 0.9988 to 0.9798 (Δ=0.0190), while the same removal on the curated same-capture split changes performance in the opposite direction — radio then encodes attack behaviour, not capture identity. Permutation importance on the naive split ranks radiotap.dbm_antsignal first (mean ΔF1=0.2315), confirming that capture-environment fields — not attack semantics alone — drive the inflated scores. Figure 13 summarises the group ablation.</w:t>
-      </w:r>
-    </w:p>
-    <w:p>
-      <w:r>
-        <w:t>FIGURE 13. Leave-one-feature-group-out macro-F1 on naive vs curated splits (LR, 3-fold CV).</w:t>
+        <w:t>FIGURE 10. t-SNE of the curated same-capture split: the same classes overlap and fragment - the honest picture.</w:t>
+      </w:r>
+      <w:r/>
+    </w:p>
+    <w:p>
+      <w:r>
+        <w:t>C2) LEAKAGE SOURCE ATTRIBUTION. t-SNE shows cluster separation under naive sampling, but not which features carry the signal. We therefore ran leave-one-feature-group-out and permutation-importance analyses on the naive across-capture split (logistic regression, 3-fold CV; n=25,000 stratified sample). Removing the radio group (RSSI, channel, rate) drops macro-F1 from 0.9988 to 0.9798 (Δ=0.0190), while the same removal on the curated same-capture split changes performance in the opposite direction — radio then encodes attack behaviour, not capture identity. Permutation importance on the naive split ranks radiotap.dbm_antsignal first (mean ΔF1=0.2315), confirming that capture-environment fields — not attack semantics alone — drive the inflated scores. Figure 11 summarises the group ablation.</w:t>
+      </w:r>
+    </w:p>
+    <w:p>
+      <w:pPr>
+        <w:jc w:val="center"/>
+      </w:pPr>
+      <w:r>
+        <w:drawing>
+          <wp:inline xmlns:a="http://schemas.openxmlformats.org/drawingml/2006/main" xmlns:pic="http://schemas.openxmlformats.org/drawingml/2006/picture">
+            <wp:extent cx="2852928" cy="1282273"/>
+            <wp:docPr id="2" name="Picture 2"/>
+            <wp:cNvGraphicFramePr>
+              <a:graphicFrameLocks noChangeAspect="1"/>
+            </wp:cNvGraphicFramePr>
+            <a:graphic>
+              <a:graphicData uri="http://schemas.openxmlformats.org/drawingml/2006/picture">
+                <pic:pic>
+                  <pic:nvPicPr>
+                    <pic:cNvPr id="0" name="fig_leakage_group_ablation.png"/>
+                    <pic:cNvPicPr/>
+                  </pic:nvPicPr>
+                  <pic:blipFill>
+                    <a:blip r:embed="rId20"/>
+                    <a:stretch>
+                      <a:fillRect/>
+                    </a:stretch>
+                  </pic:blipFill>
+                  <pic:spPr>
+                    <a:xfrm>
+                      <a:off x="0" y="0"/>
+                      <a:ext cx="2852928" cy="1282273"/>
+                    </a:xfrm>
+                    <a:prstGeom prst="rect"/>
+                  </pic:spPr>
+                </pic:pic>
+              </a:graphicData>
+            </a:graphic>
+          </wp:inline>
+        </w:drawing>
+      </w:r>
+    </w:p>
+    <w:p>
+      <w:r>
+        <w:t>FIGURE 11. Leave-one-feature-group-out macro-F1 on naive vs curated splits (LR, 3-fold CV).</w:t>
       </w:r>
     </w:p>
     <w:p>
@@ -7551,7 +7465,7 @@
         <w:pStyle w:val="PARA"/>
       </w:pPr>
       <w:r>
-        <w:t>The procedure behind those numbers is deliberately strict. Algorithm 3 never lets an attack sample touch training. Each detector learns the shape of benign traffic, we fix its threshold on benign data alone at a five-percent false-positive budget, and only then do attacks appear, at test time. That is what makes the result a fair proxy for a genuine unseen-attack.</w:t>
+        <w:t>The procedure behind those numbers is deliberately strict. Algorithm 3 never lets an attack sample touch training. Each detector learns the shape of benign traffic, we fix its threshold on benign data alone at a five-percent false-positive budget, and only then do attacks appear, at test time. That is what makes the result a fair proxy for a genuine unseen-attack. The operating threshold is a quantile of benign scores at the five-percent budget; ROC-AUC, our headline unseen-attack metric, is threshold-independent, while the stability of that operating point across different benign captures is left to future work.</w:t>
       </w:r>
     </w:p>
     <w:p>
@@ -7793,7 +7707,7 @@
         <w:pStyle w:val="PARA"/>
       </w:pPr>
       <w:r>
-        <w:t>SHAP reasoning reports make each verdict auditable. The influential features line up with domain knowledge. SSDP detections are driven by UDP destination port, IP TTL and UDP length. KRACK is driven by channel, frequency and frame-control subtype. Evil-Twin turns on the protected-frame flag, and benign traffic on the frame-control type. The explanations also reflect the model's mistakes faithfully; for a misclassified deauthentication window the top drivers are shared with disassociation, exactly as the confusion matrix would predict. Figure 11 gives the global beeswarm view. Figures 14–16 add local bar explanations for Normal, Krack and Deauth windows (true labels), showing class-specific drivers rather than aggregate patterns alone. Explanation adds operator value without contradicting the numbers.</w:t>
+        <w:t>SHAP reasoning reports make each verdict auditable. The influential features line up with domain knowledge. SSDP detections are driven by UDP destination port, IP TTL and UDP length. KRACK is driven by channel, frequency and frame-control subtype. Evil-Twin turns on the protected-frame flag, and benign traffic on the frame-control type. The explanations also reflect the model's mistakes faithfully; for a misclassified deauthentication window the top drivers are shared with disassociation, exactly as the confusion matrix would predict. Figure 12 gives the global beeswarm view. Figures 13–15 add local bar explanations for Normal, Krack and Deauth windows (true labels), showing class-specific drivers rather than aggregate patterns alone. Because some of these cues — destination ports in particular — are close to what a signature rule would inspect, for those classes the model is effectively doing signature-like matching rather than learning novel behaviour; we note this instead of overclaiming learned semantics. Explanation adds operator value without contradicting the numbers.</w:t>
       </w:r>
     </w:p>
     <w:p>
@@ -7851,25 +7765,140 @@
           <w:b/>
           <w:bCs/>
         </w:rPr>
-        <w:t xml:space="preserve">FIGURE 11. </w:t>
-      </w:r>
-      <w:r>
-        <w:t xml:space="preserve">SHAP beeswarm for the attack-versus-benign decision (top 15 features); colour is feature value, position is push toward attack.</w:t>
-      </w:r>
-    </w:p>
-    <w:p>
-      <w:r>
-        <w:t>FIGURE 14. Local SHAP explanation — Normal traffic.</w:t>
-      </w:r>
-    </w:p>
-    <w:p>
-      <w:r>
-        <w:t>FIGURE 15. Local SHAP explanation — Krack.</w:t>
-      </w:r>
-    </w:p>
-    <w:p>
-      <w:r>
-        <w:t>FIGURE 16. Local SHAP explanation — Deauth.</w:t>
+        <w:t>FIGURE 12. SHAP beeswarm for the attack-versus-benign decision (top 15 features); colour is feature value, position is push toward attack.</w:t>
+      </w:r>
+      <w:r/>
+    </w:p>
+    <w:p>
+      <w:pPr>
+        <w:jc w:val="center"/>
+      </w:pPr>
+      <w:r>
+        <w:drawing>
+          <wp:inline xmlns:a="http://schemas.openxmlformats.org/drawingml/2006/main" xmlns:pic="http://schemas.openxmlformats.org/drawingml/2006/picture">
+            <wp:extent cx="2852928" cy="1661637"/>
+            <wp:docPr id="3" name="Picture 3"/>
+            <wp:cNvGraphicFramePr>
+              <a:graphicFrameLocks noChangeAspect="1"/>
+            </wp:cNvGraphicFramePr>
+            <a:graphic>
+              <a:graphicData uri="http://schemas.openxmlformats.org/drawingml/2006/picture">
+                <pic:pic>
+                  <pic:nvPicPr>
+                    <pic:cNvPr id="0" name="fig_shap_local_Normal.png"/>
+                    <pic:cNvPicPr/>
+                  </pic:nvPicPr>
+                  <pic:blipFill>
+                    <a:blip r:embed="rId21"/>
+                    <a:stretch>
+                      <a:fillRect/>
+                    </a:stretch>
+                  </pic:blipFill>
+                  <pic:spPr>
+                    <a:xfrm>
+                      <a:off x="0" y="0"/>
+                      <a:ext cx="2852928" cy="1661637"/>
+                    </a:xfrm>
+                    <a:prstGeom prst="rect"/>
+                  </pic:spPr>
+                </pic:pic>
+              </a:graphicData>
+            </a:graphic>
+          </wp:inline>
+        </w:drawing>
+      </w:r>
+    </w:p>
+    <w:p>
+      <w:r>
+        <w:t>FIGURE 13. Local SHAP explanation — Normal traffic.</w:t>
+      </w:r>
+    </w:p>
+    <w:p>
+      <w:pPr>
+        <w:jc w:val="center"/>
+      </w:pPr>
+      <w:r>
+        <w:drawing>
+          <wp:inline xmlns:a="http://schemas.openxmlformats.org/drawingml/2006/main" xmlns:pic="http://schemas.openxmlformats.org/drawingml/2006/picture">
+            <wp:extent cx="2852928" cy="1620042"/>
+            <wp:docPr id="4" name="Picture 4"/>
+            <wp:cNvGraphicFramePr>
+              <a:graphicFrameLocks noChangeAspect="1"/>
+            </wp:cNvGraphicFramePr>
+            <a:graphic>
+              <a:graphicData uri="http://schemas.openxmlformats.org/drawingml/2006/picture">
+                <pic:pic>
+                  <pic:nvPicPr>
+                    <pic:cNvPr id="0" name="fig_shap_local_Krack.png"/>
+                    <pic:cNvPicPr/>
+                  </pic:nvPicPr>
+                  <pic:blipFill>
+                    <a:blip r:embed="rId22"/>
+                    <a:stretch>
+                      <a:fillRect/>
+                    </a:stretch>
+                  </pic:blipFill>
+                  <pic:spPr>
+                    <a:xfrm>
+                      <a:off x="0" y="0"/>
+                      <a:ext cx="2852928" cy="1620042"/>
+                    </a:xfrm>
+                    <a:prstGeom prst="rect"/>
+                  </pic:spPr>
+                </pic:pic>
+              </a:graphicData>
+            </a:graphic>
+          </wp:inline>
+        </w:drawing>
+      </w:r>
+    </w:p>
+    <w:p>
+      <w:r>
+        <w:t>FIGURE 14. Local SHAP explanation — Krack.</w:t>
+      </w:r>
+    </w:p>
+    <w:p>
+      <w:pPr>
+        <w:jc w:val="center"/>
+      </w:pPr>
+      <w:r>
+        <w:drawing>
+          <wp:inline xmlns:a="http://schemas.openxmlformats.org/drawingml/2006/main" xmlns:pic="http://schemas.openxmlformats.org/drawingml/2006/picture">
+            <wp:extent cx="2852928" cy="1661637"/>
+            <wp:docPr id="5" name="Picture 5"/>
+            <wp:cNvGraphicFramePr>
+              <a:graphicFrameLocks noChangeAspect="1"/>
+            </wp:cNvGraphicFramePr>
+            <a:graphic>
+              <a:graphicData uri="http://schemas.openxmlformats.org/drawingml/2006/picture">
+                <pic:pic>
+                  <pic:nvPicPr>
+                    <pic:cNvPr id="0" name="fig_shap_local_Deauth.png"/>
+                    <pic:cNvPicPr/>
+                  </pic:nvPicPr>
+                  <pic:blipFill>
+                    <a:blip r:embed="rId23"/>
+                    <a:stretch>
+                      <a:fillRect/>
+                    </a:stretch>
+                  </pic:blipFill>
+                  <pic:spPr>
+                    <a:xfrm>
+                      <a:off x="0" y="0"/>
+                      <a:ext cx="2852928" cy="1661637"/>
+                    </a:xfrm>
+                    <a:prstGeom prst="rect"/>
+                  </pic:spPr>
+                </pic:pic>
+              </a:graphicData>
+            </a:graphic>
+          </wp:inline>
+        </w:drawing>
+      </w:r>
+    </w:p>
+    <w:p>
+      <w:r>
+        <w:t>FIGURE 15. Local SHAP explanation — Deauth.</w:t>
       </w:r>
     </w:p>
     <w:p>
@@ -7885,7 +7914,7 @@
         <w:pStyle w:val="PARA"/>
       </w:pPr>
       <w:r>
-        <w:t xml:space="preserve">Efficiency decides whether a detector is usable, so we measured it rather than asserted it. Classification is cheap: on CPU the best model scores a feature vector in well under a microsecond in bulk, and Table 4 lists the per-sample latency for each model. Figure 12 puts that in context. The real per-window cost is feature extraction, near 0.7 ms for a forty-frame window, while the model itself is an order of magnitude cheaper. In other words the classifier is never the bottleneck, and the whole per-window budget stays comfortably inside real time for a streaming deployment. We report these numbers on purpose; they are usually left out of the 802.11 IDS literature.</w:t>
+        <w:t>Efficiency and resource use decide whether a detector is deployable, so we measured them rather than asserted them. On our test platform (Intel Core Ultra 7 155H, 32 GB RAM, Windows 11, CPU-only), XGBoost inference averages 3.47 µs per 34-feature vector (Table 4). Feature extraction over a 40-frame window adds 727 µs, for 730.4 µs end-to-end per window — about 1369 windows/s sustained throughput. During a 50,000-prediction stress test the Python process peaked at 11.9 MB heap and averaged 2.2% of one logical CPU core. Classification is therefore not the bottleneck; windowed feature extraction dominates (Figure 16 breaks the per-stage cost down), and the full path remains comfortably real-time for streaming 802.11 monitoring. These deployment-oriented numbers are rarely reported in 802.11 IDS literature.</w:t>
       </w:r>
     </w:p>
     <w:p>
@@ -7943,11 +7972,9 @@
           <w:b/>
           <w:bCs/>
         </w:rPr>
-        <w:t xml:space="preserve">FIGURE 12. </w:t>
-      </w:r>
-      <w:r>
-        <w:t xml:space="preserve">Per-stage CPU latency (log scale): feature extraction over a 40-frame window dominates; classification is negligible.</w:t>
-      </w:r>
+        <w:t>FIGURE 16. Per-stage CPU latency (log scale): feature extraction over a 40-frame window dominates; classification is negligible.</w:t>
+      </w:r>
+      <w:r/>
     </w:p>
     <w:p>
       <w:pPr>
@@ -7970,7 +7997,7 @@
         <w:pStyle w:val="PARA"/>
       </w:pPr>
       <w:r>
-        <w:t xml:space="preserve">The contribution here is mostly about method, not a new record. Much of the AWID3 literature optimizes for the highest number. We did the reverse. We isolated a mechanism that can manufacture such numbers, measured it, and then reported what remains once it is removed. What remains is still strong, and it is explainable and fast. Two things set the work apart. One is the leakage analysis itself. The other is a plain-language explanation attached to every detection. Neither is common in 802.11-specific research, and both matter to anyone who has to defend a deployed detector.</w:t>
+        <w:t>The contribution here is mostly about method, not a new record. Much of the AWID3 literature optimizes for the highest number. We did the reverse. We isolated a mechanism that can manufacture such numbers, measured it, and then reported what remains once it is removed. What remains is still strong, and it is explainable and fast. Two things set the work apart. One is the leakage analysis itself. The other is a plain-language explanation attached to every detection. Neither is common in 802.11-specific research, and both matter to anyone who has to defend a deployed detector. While recent temporal-context and hybrid models report higher headline numbers on coarser class sets or without a measured leakage split, it is precisely our controlled protocol that exposes the true fourteen-class difficulty; a like-for-like ranking would require re-running those models under the same leakage control, which we leave as an open invitation to the community.</w:t>
       </w:r>
     </w:p>
     <w:p>
@@ -7979,6 +8006,11 @@
       </w:pPr>
       <w:r>
         <w:t>B. PIPELINE PORTABILITY (SECONDARY)</w:t>
+      </w:r>
+    </w:p>
+    <w:p>
+      <w:r>
+        <w:t>B2) GENERALIZABILITY OF CAPTURE-ENVIRONMENT LEAKAGE. The mechanism we isolate is not AWID3-specific. Any labelled 802.11 corpus in which benign and attack frames are drawn from different capture sessions — AWID, AWID2, or newly collected enterprise traces — can exhibit the same inflation: models learn session fingerprints (radio level, channel, timing context) instead of attack semantics. Our leave-one-group-out analysis shows radio fields alone can drop naive-split macro-F1 by ~0.02 while leaving curated same-capture performance unchanged in meaning. We validate the effect on AWID3; AWID2 cross-corpus replication remains future work, but the underlying risk applies wherever per-class files encode different recording environments.</w:t>
       </w:r>
     </w:p>
     <w:p>
@@ -8739,7 +8771,7 @@
         <w:pStyle w:val="PARA"/>
       </w:pPr>
       <w:r>
-        <w:t xml:space="preserve">A model that scores well offline still has to survive contact with a live network, and three problems deserve naming. The first is concept drift. Traffic changes with new applications, new devices and seasonal patterns, and a detector frozen at training time slowly goes stale; the benign-only autoencoder and periodic re-training in our platform are a partial answer, but explicit drift monitoring is future work. The second is new hardware. A previously unseen access point, or a firmware update on an existing one, can shift the radio fingerprint enough to raise false positives, so a short per-site re-calibration window is prudent before enforcement is switched on. The third is the moving target of the standard. WPA3 is still rolling out and WPA4 will follow; each brings new handshakes and new attacks — our KRACK and Kr00k classes are only today's examples — so the feature set and the label space will have to grow with it. None of these is unique to our approach, but a detector meant for real 802.11 networks has to plan for all three.</w:t>
+        <w:t>A model that scores well offline still has to survive contact with a live network, and three problems deserve naming. The first is concept drift. Traffic changes with new applications, new devices and seasonal patterns, and a detector frozen at training time slowly goes stale; the benign-only autoencoder and periodic re-training in our platform are a partial answer, but explicit drift monitoring is future work. The second is new hardware. A previously unseen access point, or a firmware update on an existing one, can shift the radio fingerprint enough to raise false positives, so a short per-site re-calibration window is prudent before enforcement is switched on. The third is the moving target of the standard. WPA3 is still rolling out and future amendments to the standard — a prospective WPA4 and beyond — will follow; each brings new handshakes and potentially new attacks — our KRACK and Kr00k classes are only today's examples — so the feature set and the label space will have to grow with it. None of these is unique to our approach, but a detector meant for real 802.11 networks has to plan for all three.</w:t>
       </w:r>
     </w:p>
     <w:p>
@@ -8759,7 +8791,7 @@
           <w:b/>
           <w:bCs/>
         </w:rPr>
-        <w:t>Evaluation scope. The wireless evaluation rests on a single corpus, AWID3, and its curated subset, though leakage-controlled, is one testbed. Section VII-B shows the pipeline runs on wired flow datasets as a portability check, but cross-wireless-dataset validation remains the highest-priority extension: AWID2 would directly test whether capture-environment leakage generalises beyond AWID3, but was not available for this study; live traffic validation is likewise future work.</w:t>
+        <w:t>Evaluation scope. The wireless evaluation rests on a single corpus, AWID3, and its curated subset, though controlled for leakage, is one testbed. Section VII-B shows the pipeline runs on wired flow datasets as a portability check, but cross-wireless-dataset validation remains the highest-priority extension: AWID2 would directly test whether capture-environment leakage generalises beyond AWID3, but was not available for this study; live traffic validation is likewise future work.</w:t>
       </w:r>
       <w:r/>
     </w:p>
@@ -8772,11 +8804,9 @@
           <w:b/>
           <w:bCs/>
         </w:rPr>
-        <w:t xml:space="preserve">Class imbalance. </w:t>
-      </w:r>
-      <w:r>
-        <w:t xml:space="preserve">Several attack classes are small, with tens to a few hundred samples, which limits confidence in their per-class metrics.</w:t>
-      </w:r>
+        <w:t>Class imbalance. Several attack classes are small, with tens to a few hundred samples, which limits confidence in their per-class metrics. We therefore lead with macro-averaged F1, report bootstrap confidence intervals (Section VI), and use stratified folds that keep every class present in each partition; even so, per-class scores for the smallest categories (SQL_Injection, RogueAP) should be read as indicative, and larger same-capture samples are needed to tighten them.</w:t>
+      </w:r>
+      <w:r/>
     </w:p>
     <w:p>
       <w:pPr>
@@ -8800,11 +8830,9 @@
           <w:b/>
           <w:bCs/>
         </w:rPr>
-        <w:t xml:space="preserve">Full-archive protocol. </w:t>
-      </w:r>
-      <w:r>
-        <w:t xml:space="preserve">A same-capture sampling of the full archive — which would exploit its scale without leakage — is identified but not implemented here.</w:t>
-      </w:r>
+        <w:t>Full-archive protocol. A same-capture sampling of the full archive — which would exploit its scale without leakage — is identified but not implemented here; it is the natural way to use the corpus scale without reintroducing leakage and is a priority extension alongside cross-wireless-dataset validation. It is deferred here for a practical reason: same-capture sampling across the full 43 GB archive is memory- and compute-intensive, whereas the curated subset already isolates the leakage effect cleanly. We plan to release a larger same-capture build of the full corpus, with the same scripted policy, as a follow-up artifact.</w:t>
+      </w:r>
+      <w:r/>
     </w:p>
     <w:p>
       <w:pPr>
@@ -8819,7 +8847,7 @@
         <w:pStyle w:val="PARA"/>
       </w:pPr>
       <w:r>
-        <w:t>We studied machine-learning intrusion detection for IEEE 802.11 through a leakage-aware lens. Naive sampling of the full AWID3 corpus produces capture-environment leakage, and with it near-perfect scores that do not mean what they appear to mean. Under a controlled protocol the honest picture emerges: 0.976 macro-F1 and 0.9998 ROC-AUC across fourteen classes, an autoencoder that catches unseen attacks at 0.991 ROC-AUC, SHAP explanations that line up with what analysts expect, a working set of fifteen to twenty features, and inference in microseconds. The same pipeline, applied unchanged to the wired CIC-IDS-2017 and CSE-CIC-IDS2018 flow datasets, reaches 0.982 and 0.902 macro-F1, which indicates the tooling is portable, not that wireless conclusions transfer to wired flow data. None of this required hiding the hard cases. Deauthentication still blurs into disassociation, and web-layer spoofing still resists anomaly detection, and the paper says so. Next we will sample the full archive within captures, so its scale can be used without leakage; extend the graph and multi-sensor parts to live traces; and test the whole system on real deployments.</w:t>
+        <w:t>We studied machine-learning intrusion detection for IEEE 802.11 through a leakage-aware lens. Naive sampling of the full AWID3 corpus produces capture-environment leakage, and with it near-perfect scores that do not mean what they appear to mean. Under a controlled protocol a rigorous, controlled picture emerges: 0.976 macro-F1 and 0.9998 ROC-AUC across fourteen classes, an autoencoder that catches unseen attacks at 0.991 ROC-AUC, SHAP explanations that line up with what analysts expect, a working set of fifteen to twenty features, and inference in microseconds. The same pipeline, applied unchanged to the wired CIC-IDS-2017 and CSE-CIC-IDS2018 flow datasets, reaches 0.982 and 0.902 macro-F1, which indicates the tooling is portable, not that wireless conclusions transfer to wired flow data. None of this required hiding the hard cases. Deauthentication still blurs into disassociation, and web-layer spoofing still resists anomaly detection, and the paper says so. Next we will sample the full archive within captures, so its scale can be used without leakage; extend the graph and multi-sensor parts to live traces; test the whole system on real deployments; and compress the model for edge devices through ONNX export and post-training quantization.</w:t>
       </w:r>
     </w:p>
     <w:p>
@@ -8857,7 +8885,7 @@
         <w:pStyle w:val="PARA"/>
       </w:pPr>
       <w:r>
-        <w:t xml:space="preserve">All datasets used here are public. AWID3 is due to Chatzoglou et al. [3] and is available at https://icsdweb.aegean.gr/awid/ (Kaggle mirror: https://www.kaggle.com/datasets/suumia/awid3-dataset). The generalization study of Section VII-B uses CIC-IDS-2017 (https://www.kaggle.com/datasets/chethuhn/network-intrusion-dataset) and CSE-CIC-IDS2018 (https://www.kaggle.com/datasets/solarmainframe/ids-intrusion-csv), both produced by the Canadian Institute for Cybersecurity, University of New Brunswick.</w:t>
+        <w:t>All datasets used here are public. AWID3 is due to Chatzoglou et al. [5] and is available at https://icsdweb.aegean.gr/awid/ (Kaggle mirror: https://www.kaggle.com/datasets/suumia/awid3-dataset). The generalization study of Section VII-B uses CIC-IDS-2017 (https://www.kaggle.com/datasets/chethuhn/network-intrusion-dataset) and CSE-CIC-IDS2018 (https://www.kaggle.com/datasets/solarmainframe/ids-intrusion-csv), both produced by the Canadian Institute for Cybersecurity, University of New Brunswick.</w:t>
       </w:r>
     </w:p>
     <w:p>
@@ -8870,385 +8898,247 @@
     </w:p>
     <w:p>
       <w:r>
+        <w:t>[1] M. Agarwal, S. Biswas, and S. Nandi, "Detection of de-authentication DoS attacks in Wi-Fi networks: A machine learning approach," in Proc. IEEE Int. Conf. Syst., Man, Cybern., 2015, pp. 246–251.</w:t>
+      </w:r>
+    </w:p>
+    <w:p>
+      <w:r>
+        <w:t>[2] M. Agarwal, S. Purwar, S. Biswas, and S. Nandi, "Intrusion detection system for PS-Poll DoS attack in 802.11 networks using real time discrete event system," IEEE/CAA J. Automatica Sinica, vol. 4, no. 4, pp. 792–808, 2017.</w:t>
+      </w:r>
+    </w:p>
+    <w:p>
+      <w:r>
+        <w:t>[3] M. Vanhoef and F. Piessens, “Key reinstallation attacks: Forcing nonce reuse in WPA2,” in Proc. ACM SIGSAC Conf. Comput. Commun. Security (CCS), 2017, pp. 1313–1328.</w:t>
+      </w:r>
+    </w:p>
+    <w:p>
+      <w:r>
+        <w:t>[4] C. Kolias, G. Kambourakis, A. Stavrou, and S. Gritzalis, “Intrusion detection in 802.11 networks: Empirical evaluation of threats and a public dataset,” IEEE Commun. Surveys Tuts., vol. 18, no. 1, pp. 184–208, 2016, doi: 10.1109/COMST.2015.2402161.</w:t>
+      </w:r>
+    </w:p>
+    <w:p>
+      <w:r>
+        <w:t>[5] E. Chatzoglou, G. Kambourakis, and C. Kolias, “Empirical evaluation of attacks against IEEE 802.11 enterprise networks: The AWID3 dataset,” IEEE Access, vol. 9, pp. 34188–34205, 2021.</w:t>
+      </w:r>
+    </w:p>
+    <w:p>
+      <w:r>
+        <w:t>[6] E. Chatzoglou, G. Kambourakis, C. Kolias, and C. Smiliotopoulos, “Pick quality over quantity: Expert feature selection and data preprocessing for 802.11 intrusion detection systems,” IEEE Access, vol. 10, pp. 64761–64784, 2022.</w:t>
+      </w:r>
+    </w:p>
+    <w:p>
+      <w:r>
+        <w:t>[7] S. M. Kasongo and Y. Sun, “A deep learning method with wrapper based feature extraction for wireless intrusion detection system,” Computers &amp; Security, vol. 92, art. 101752, 2020, doi: 10.1016/j.cose.2020.101752.</w:t>
+      </w:r>
+    </w:p>
+    <w:p>
+      <w:r>
+        <w:t>[8] D. S. Berman, A. L. Buczak, J. S. Chavis, and C. L. Corbett, "A survey of deep learning methods for cyber security," Information, vol. 10, no. 4, art. 122, 2019.</w:t>
+      </w:r>
+    </w:p>
+    <w:p>
+      <w:r>
+        <w:t>[9] A. M. Mahfouz, D. Venugopal, and S. G. Shiva, "Comparative analysis of ML classifiers for network intrusion detection," in Proc. 4th Int. Congr. Inf. Commun. Technol., Springer, 2020, pp. 193–207.</w:t>
+      </w:r>
+    </w:p>
+    <w:p>
+      <w:r>
+        <w:t>[10] N. Khalid, S. Hina, K. S. Zaidi, T. Gaber, L. Speakman, and Z. Noor, “An investigation of feature reduction, transferability, and generalization in AWID datasets for secure Wi-Fi networks,” PLoS ONE, 2025.</w:t>
+      </w:r>
+    </w:p>
+    <w:p>
+      <w:r>
+        <w:t>[11] S. Wang and B. Li, “Intrusion detection for WiFi network: A deep learning approach,” in Proc. 11th EAI Int. Conf. Wireless Internet (WiCON 2018), LNICST, Springer, pp. 95–104, 2019.</w:t>
+      </w:r>
+    </w:p>
+    <w:p>
+      <w:r>
+        <w:t>[12] S. M. Kasongo and Y. Sun, “A deep long short-term memory based classifier for wireless intrusion detection system,” ICT Express, vol. 6, no. 2, 2020, doi: 10.1016/j.icte.2019.08.004.</w:t>
+      </w:r>
+    </w:p>
+    <w:p>
+      <w:r>
+        <w:t>[13] V. L. L. Thing, “IEEE 802.11 network anomaly detection and attack classification: A deep learning approach,” in Proc. IEEE Wireless Commun. Netw. Conf. (WCNC), 2017.</w:t>
+      </w:r>
+    </w:p>
+    <w:p>
+      <w:r>
+        <w:t>[14] P. Satam and S. Hariri, “WIDS: An anomaly-based intrusion detection system for Wi-Fi (IEEE 802.11) protocol,” IEEE Trans. Netw. Service Manag., vol. 18, no. 1, 2021, doi: 10.1109/TNSM.2020.3036138.</w:t>
+      </w:r>
+    </w:p>
+    <w:p>
+      <w:r>
+        <w:t>[15] L. M. da Silva, V. M. Andreghetti, R. A. F. Romero, and K. R. L. J. C. Branco, “Analysis and identification of Evil Twin attack through data science techniques using the AWID3 dataset,” 2023, doi: 10.1145/3635638.3635665.</w:t>
+      </w:r>
+    </w:p>
+    <w:p>
+      <w:r>
+        <w:t>[16] Z. Salah and E. Abu Elsoud, “Enhancing network security: A machine-learning-based approach for detecting and mitigating KRACK and Kr00k attacks in IEEE 802.11,” Future Internet, vol. 15, no. 8, art. 269, 2023, doi: 10.3390/fi15080269.</w:t>
+      </w:r>
+    </w:p>
+    <w:p>
+      <w:r>
+        <w:t>[17] M. E. Aminanto and K. Kim, “Improving detection of Wi-Fi impersonation by fully unsupervised deep learning,” in Proc. Int. Workshop Inf. Security Appl. (WISA), 2018, doi: 10.1007/978-3-319-93563-8_18.</w:t>
+      </w:r>
+    </w:p>
+    <w:p>
+      <w:r>
+        <w:t>[18] A. Agrawal, U. Chatterjee, and R. Maiti, “CheckShake: Passively detecting anomaly in Wi-Fi security handshake using gradient boosting based ensemble learning,” IEEE Trans. Dependable Secure Comput., 2023, doi: 10.1109/TDSC.2023.3236355.</w:t>
+      </w:r>
+    </w:p>
+    <w:p>
+      <w:r>
+        <w:t>[19] M. E. Aminanto, R. Choi, H. C. Tanuwidjaja, P. D. Yoo, and K. Kim, “Deep abstraction and weighted feature selection for Wi-Fi impersonation detection,” IEEE Trans. Inf. Forensics Security, vol. 13, 2018, doi: 10.1109/TIFS.2017.2762828.</w:t>
+      </w:r>
+    </w:p>
+    <w:p>
+      <w:r>
+        <w:t>[20] S. M. Kasongo and Y. Sun, “A deep learning method with filter based feature engineering for wireless intrusion detection system,” IEEE Access, vol. 7, 2019, doi: 10.1109/ACCESS.2019.2905633.</w:t>
+      </w:r>
+    </w:p>
+    <w:p>
+      <w:r>
+        <w:t>[21] R. Kohavi and G. H. John, "Wrappers for feature subset selection," Artif. Intell., vol. 97, nos. 1–2, pp. 273–324, 1997.</w:t>
+      </w:r>
+    </w:p>
+    <w:p>
+      <w:r>
+        <w:t>[22] S. Bhandari, A. K. Kukreja, A. Lazar, A. Sim, and K. Wu, "Feature selection improves tree-based classification for wireless intrusion detection," in Proc. 3rd Int. Workshop Syst. Netw. Telemetry Analytics, 2020, pp. 19–26.</w:t>
+      </w:r>
+    </w:p>
+    <w:p>
+      <w:r>
+        <w:t>[23] Y. Qin, B. Li, M. Yang, and Z. Yan, "Attack detection for wireless enterprise network: A machine learning approach," in Proc. IEEE Int. Conf. Signal Process., Commun. Comput. (ICSPCC), 2018, pp. 1–6.</w:t>
+      </w:r>
+    </w:p>
+    <w:p>
+      <w:r>
+        <w:t>[24] J.-h. Woo, J.-Y. Song, and Y.-J. Choi, "Performance enhancement of deep neural network using feature selection and preprocessing for intrusion detection," in Proc. Int. Conf. Artif. Intell. Inf. Commun. (ICAIIC), IEEE, 2019, pp. 415–417.</w:t>
+      </w:r>
+    </w:p>
+    <w:p>
+      <w:r>
+        <w:t>[25] R. Abdulhammed, M. Faezipour, A. Abuzneid, and A. Alessa, "Effective features selection and machine learning classifiers for improved wireless intrusion detection," in Proc. Int. Symp. Netw., Comput. Commun. (ISNCC), IEEE, 2018, pp. 1–6.</w:t>
+      </w:r>
+    </w:p>
+    <w:p>
+      <w:r>
+        <w:t>[26] M. E. Aminanto, H. C. Tanuwidjaja, P. D. Yoo, and K. Kim, "Wi-Fi intrusion detection using weighted-feature selection for neural networks classifier," in Proc. Int. Workshop Big Data Inf. Security (IWBIS), IEEE, 2017, pp. 99–104.</w:t>
+      </w:r>
+    </w:p>
+    <w:p>
+      <w:r>
+        <w:t>[27] J. Ran, Y. Ji, and B. Tang, “A semi-supervised learning approach to IEEE 802.11 network anomaly detection,” in Proc. IEEE Veh. Technol. Conf. (VTC-Spring), 2019, doi: 10.1109/VTCSpring.2019.8746576.</w:t>
+      </w:r>
+    </w:p>
+    <w:p>
+      <w:r>
+        <w:t>[28] S. Solpan, H. Gündüz, K. Küçük, and F. Özyurt, “A hybrid feature fusion approach for multiclass Wi-Fi intrusion detection using classical machine learning,” Int. J. Inf. Secur., 2026, doi: 10.1007/s10207-026-01224-2.</w:t>
+      </w:r>
+    </w:p>
+    <w:p>
+      <w:r>
+        <w:t>[29] S. Solpan, H. Gündüz, and K. Küçük, “Wi-Fi network intrusion detection: Enhanced with feature extraction and machine learning algorithms,” in Proc. 8th Int. Artif. Intell. Data Process. Symp. (IDAP), 2024, doi: 10.1109/IDAP64064.2024.10710685.</w:t>
+      </w:r>
+    </w:p>
+    <w:p>
+      <w:r>
+        <w:t>[30] H. Jiang, Y. Yan, and X. Li, “Temporal context-enhanced wireless intrusion detection: Boosting recall for hard-to-detect attacks,” in Proc. IEEE Int. Conf. Blockchain Technol. Inf. Secur. (ICBCTIS), 2025, doi: 10.1109/ICBCTIS66509.2025.11387671.</w:t>
+      </w:r>
+    </w:p>
+    <w:p>
+      <w:r>
+        <w:t>[31] M. Thankappan, H. Rifà-Pous, and C. Garrigues, “A signature-based wireless intrusion detection system framework for multi-channel man-in-the-middle attacks against protected Wi-Fi networks,” IEEE Access, 2024, doi: 10.1109/ACCESS.2024.3362803.</w:t>
+      </w:r>
+    </w:p>
+    <w:p>
+      <w:r>
+        <w:t>[32] S. M. Trisha, S. Islam, and M. Hossen, “Performance evaluation of deep learning techniques for wireless intrusion detection system: A comparative feature selection approach,” in Proc. 27th Int. Conf. Comput. Inf. Technol. (ICCIT), 2024, doi: 10.1109/ICCIT64611.2024.11022476.</w:t>
+      </w:r>
+    </w:p>
+    <w:p>
+      <w:r>
+        <w:t>[33] C. Hamroun, A. Fladenmuller, M. Pariente, and G. Pujolle, “Enriching the assessment of neural network-based wireless intrusion detection systems: A case study on Wi-Fi networks,” in Proc. Cyber Secur. Netw. Conf. (CSNet), 2025, doi: 10.1109/CSNet67572.2025.11288215.</w:t>
+      </w:r>
+    </w:p>
+    <w:p>
+      <w:r>
+        <w:t>[34] P. Phalaagae, A. M. Zungeru, A. Yahya, B. Sigweni, and S. Rajalakshmi, “A hybrid CNN-LSTM model with attention mechanism for improved intrusion detection in wireless IoT sensor networks,” IEEE Access, 2025, doi: 10.1109/ACCESS.2025.3555861.</w:t>
+      </w:r>
+    </w:p>
+    <w:p>
+      <w:r>
+        <w:t>[35] S. M. Lundberg and S.-I. Lee, “A unified approach to interpreting model predictions,” in Proc. Adv. Neural Inf. Process. Syst. (NeurIPS), 2017, pp. 4765–4774.</w:t>
+      </w:r>
+    </w:p>
+    <w:p>
+      <w:r>
+        <w:t>[36] Redis Ltd., “Redis: The real-time data platform,” 2026. [Online]. Available: https://redis.io. Accessed: Jul. 1, 2026.</w:t>
+      </w:r>
+    </w:p>
+    <w:p>
+      <w:r>
+        <w:t>[37] Apache Software Foundation, “Apache Kafka: A distributed event streaming platform,” 2026. [Online]. Available: https://kafka.apache.org. Accessed: Jul. 2, 2026.</w:t>
+      </w:r>
+    </w:p>
+    <w:p>
+      <w:r>
+        <w:t>[38] Microsoft, “Microsoft SQL Server,” 2026. [Online]. Available: https://www.microsoft.com/sql-server. Accessed: Jul. 3, 2026.</w:t>
+      </w:r>
+    </w:p>
+    <w:p>
+      <w:r>
+        <w:t>[39] Elastic N.V., “Elasticsearch: The heart of the Elastic Stack,” 2026. [Online]. Available: https://www.elastic.co/elasticsearch. Accessed: Jul. 4, 2026.</w:t>
+      </w:r>
+    </w:p>
+    <w:p>
+      <w:r>
+        <w:t>[40] T. Chen and C. Guestrin, “XGBoost: A scalable tree boosting system,” in Proc. 22nd ACM SIGKDD Int. Conf. Knowl. Discovery Data Mining, 2016, pp. 785–794.</w:t>
+      </w:r>
+    </w:p>
+    <w:p>
+      <w:r>
+        <w:t>[41] G. Ke et al., “LightGBM: A highly efficient gradient boosting decision tree,” in Proc. NeurIPS, 2017, pp. 3146–3154.</w:t>
+      </w:r>
+    </w:p>
+    <w:p>
+      <w:r>
+        <w:t>[42] F. Pedregosa et al., “Scikit-learn: Machine learning in Python,” J. Mach. Learn. Res., vol. 12, pp. 2825–2830, 2011.</w:t>
+      </w:r>
+    </w:p>
+    <w:p>
+      <w:r>
+        <w:t>[43] A. Vaswani et al., “Attention is all you need,” in Proc. NeurIPS, 2017, pp. 5998–6008.</w:t>
+      </w:r>
+    </w:p>
+    <w:p>
+      <w:r>
+        <w:t>[44] F. T. Liu, K. M. Ting, and Z.-H. Zhou, “Isolation forest,” in Proc. 8th IEEE Int. Conf. Data Mining (ICDM), 2008, pp. 413–422.</w:t>
+      </w:r>
+    </w:p>
+    <w:p>
+      <w:r>
+        <w:t>[45] D. P. Kingma and M. Welling, “Auto-encoding variational Bayes,” in Proc. Int. Conf. Learn. Representations (ICLR), 2014.</w:t>
+      </w:r>
+    </w:p>
+    <w:p>
+      <w:r>
+        <w:t>[46] L. Ruff et al., “Deep one-class classification,” in Proc. 35th Int. Conf. Mach. Learn. (ICML), 2018, pp. 4393–4402.</w:t>
+      </w:r>
+    </w:p>
+    <w:p>
+      <w:r>
         <w:t>APPENDIX A. LEAKAGE-CONTROLLED FEATURE SET (34 FIELDS)</w:t>
       </w:r>
     </w:p>
     <w:p>
       <w:r>
-        <w:t>The count is not hand-tuned: 254 AWID3 numeric fields minus policy-defined leaky columns minus all-zero columns in the curated 74,270-row build yields exactly 34.</w:t>
+        <w:t>The count is not hand-tuned: 254 AWID3 numeric fields minus policy-defined leaky columns minus all-zero columns in the curated 74,270-row build yields exactly 34. One retained field deserves comment: radiotap.dbm_antsignal is the strongest leakage carrier under the naive split (permutation importance 0.23, the single largest), yet it remains the top predictor on the curated same-capture data (0.34). The two roles differ: across captures it fingerprints the recording session, whereas within a capture it reflects legitimate physical variation between stations, which is exactly the signal a live detector would also see.</w:t>
       </w:r>
     </w:p>
     <w:p>
       <w:r>
         <w:t>Table A1 lists the exact fields retained after the policy in Section IV-A.</w:t>
-      </w:r>
-    </w:p>
-    <w:p>
-      <w:r>
-        <w:t>TABLE A1. Thirty-four leakage-controlled AWID3 per-frame features.</w:t>
-      </w:r>
-    </w:p>
-    <w:p>
-      <w:pPr>
-        <w:pStyle w:val="Ref"/>
-      </w:pPr>
-      <w:r>
-        <w:t xml:space="preserve">[1] </w:t>
-      </w:r>
-      <w:r>
-        <w:t xml:space="preserve">M. Vanhoef and F. Piessens, “Key reinstallation attacks: Forcing nonce reuse in WPA2,” in Proc. ACM SIGSAC Conf. Comput. Commun. Security (CCS), 2017, pp. 1313–1328.</w:t>
-      </w:r>
-    </w:p>
-    <w:p>
-      <w:pPr>
-        <w:pStyle w:val="Ref"/>
-      </w:pPr>
-      <w:r>
-        <w:t xml:space="preserve">[2] </w:t>
-      </w:r>
-      <w:r>
-        <w:t xml:space="preserve">C. Kolias, G. Kambourakis, A. Stavrou, and S. Gritzalis, “Intrusion detection in 802.11 networks: Empirical evaluation of threats and a public dataset,” IEEE Commun. Surveys Tuts., vol. 18, no. 1, pp. 184–208, 2016, doi: 10.1109/COMST.2015.2402161.</w:t>
-      </w:r>
-    </w:p>
-    <w:p>
-      <w:pPr>
-        <w:pStyle w:val="Ref"/>
-      </w:pPr>
-      <w:r>
-        <w:t xml:space="preserve">[3] </w:t>
-      </w:r>
-      <w:r>
-        <w:t xml:space="preserve">E. Chatzoglou, G. Kambourakis, and C. Kolias, “Empirical evaluation of attacks against IEEE 802.11 enterprise networks: The AWID3 dataset,” IEEE Access, vol. 9, pp. 34188–34205, 2021.</w:t>
-      </w:r>
-    </w:p>
-    <w:p>
-      <w:pPr>
-        <w:pStyle w:val="Ref"/>
-      </w:pPr>
-      <w:r>
-        <w:t xml:space="preserve">[4] </w:t>
-      </w:r>
-      <w:r>
-        <w:t xml:space="preserve">E. Chatzoglou, G. Kambourakis, C. Kolias, and C. Smiliotopoulos, “Pick quality over quantity: Expert feature selection and data preprocessing for 802.11 intrusion detection systems,” IEEE Access, vol. 10, pp. 64761–64784, 2022.</w:t>
-      </w:r>
-    </w:p>
-    <w:p>
-      <w:pPr>
-        <w:pStyle w:val="Ref"/>
-      </w:pPr>
-      <w:r>
-        <w:t xml:space="preserve">[5] </w:t>
-      </w:r>
-      <w:r>
-        <w:t xml:space="preserve">S. M. Kasongo and Y. Sun, “A deep learning method with wrapper based feature extraction for wireless intrusion detection system,” Computers &amp; Security, vol. 92, art. 101752, 2020, doi: 10.1016/j.cose.2020.101752.</w:t>
-      </w:r>
-    </w:p>
-    <w:p>
-      <w:pPr>
-        <w:pStyle w:val="Ref"/>
-      </w:pPr>
-      <w:r>
-        <w:t xml:space="preserve">[6] </w:t>
-      </w:r>
-      <w:r>
-        <w:t xml:space="preserve">N. Khalid, S. Hina, K. S. Zaidi, T. Gaber, L. Speakman, and Z. Noor, “An investigation of feature reduction, transferability, and generalization in AWID datasets for secure Wi-Fi networks,” PLoS ONE, 2025.</w:t>
-      </w:r>
-    </w:p>
-    <w:p>
-      <w:pPr>
-        <w:pStyle w:val="Ref"/>
-      </w:pPr>
-      <w:r>
-        <w:t xml:space="preserve">[7] </w:t>
-      </w:r>
-      <w:r>
-        <w:t xml:space="preserve">S. Wang and B. Li, “Intrusion detection for WiFi network: A deep learning approach,” in Proc. 11th EAI Int. Conf. Wireless Internet (WiCON 2018), LNICST, Springer, pp. 95–104, 2019.</w:t>
-      </w:r>
-    </w:p>
-    <w:p>
-      <w:pPr>
-        <w:pStyle w:val="Ref"/>
-      </w:pPr>
-      <w:r>
-        <w:t xml:space="preserve">[8] </w:t>
-      </w:r>
-      <w:r>
-        <w:t xml:space="preserve">S. M. Kasongo and Y. Sun, “A deep long short-term memory based classifier for wireless intrusion detection system,” ICT Express, vol. 6, no. 2, 2020, doi: 10.1016/j.icte.2019.08.004.</w:t>
-      </w:r>
-    </w:p>
-    <w:p>
-      <w:pPr>
-        <w:pStyle w:val="Ref"/>
-      </w:pPr>
-      <w:r>
-        <w:t xml:space="preserve">[9] </w:t>
-      </w:r>
-      <w:r>
-        <w:t xml:space="preserve">V. L. L. Thing, “IEEE 802.11 network anomaly detection and attack classification: A deep learning approach,” in Proc. IEEE Wireless Commun. Netw. Conf. (WCNC), 2017.</w:t>
-      </w:r>
-    </w:p>
-    <w:p>
-      <w:pPr>
-        <w:pStyle w:val="Ref"/>
-      </w:pPr>
-      <w:r>
-        <w:t xml:space="preserve">[10] </w:t>
-      </w:r>
-      <w:r>
-        <w:t xml:space="preserve">P. Satam and S. Hariri, “WIDS: An anomaly-based intrusion detection system for Wi-Fi (IEEE 802.11) protocol,” IEEE Trans. Netw. Service Manag., vol. 18, no. 1, 2021, doi: 10.1109/TNSM.2020.3036138.</w:t>
-      </w:r>
-    </w:p>
-    <w:p>
-      <w:pPr>
-        <w:pStyle w:val="Ref"/>
-      </w:pPr>
-      <w:r>
-        <w:t xml:space="preserve">[11] </w:t>
-      </w:r>
-      <w:r>
-        <w:t xml:space="preserve">L. M. da Silva, V. M. Andreghetti, R. A. F. Romero, and K. R. L. J. C. Branco, “Analysis and identification of Evil Twin attack through data science techniques using the AWID3 dataset,” 2023, doi: 10.1145/3635638.3635665.</w:t>
-      </w:r>
-    </w:p>
-    <w:p>
-      <w:pPr>
-        <w:pStyle w:val="Ref"/>
-      </w:pPr>
-      <w:r>
-        <w:t xml:space="preserve">[12] </w:t>
-      </w:r>
-      <w:r>
-        <w:t xml:space="preserve">Z. Salah and E. Abu Elsoud, “Enhancing network security: A machine-learning-based approach for detecting and mitigating KRACK and Kr00k attacks in IEEE 802.11,” Future Internet, vol. 15, no. 8, art. 269, 2023, doi: 10.3390/fi15080269.</w:t>
-      </w:r>
-    </w:p>
-    <w:p>
-      <w:pPr>
-        <w:pStyle w:val="Ref"/>
-      </w:pPr>
-      <w:r>
-        <w:t xml:space="preserve">[13] </w:t>
-      </w:r>
-      <w:r>
-        <w:t xml:space="preserve">M. E. Aminanto and K. Kim, “Improving detection of Wi-Fi impersonation by fully unsupervised deep learning,” in Proc. Int. Workshop Inf. Security Appl. (WISA), 2018, doi: 10.1007/978-3-319-93563-8_18.</w:t>
-      </w:r>
-    </w:p>
-    <w:p>
-      <w:pPr>
-        <w:pStyle w:val="Ref"/>
-      </w:pPr>
-      <w:r>
-        <w:t xml:space="preserve">[14] </w:t>
-      </w:r>
-      <w:r>
-        <w:t xml:space="preserve">A. Agrawal, U. Chatterjee, and R. Maiti, “CheckShake: Passively detecting anomaly in Wi-Fi security handshake using gradient boosting based ensemble learning,” IEEE Trans. Dependable Secure Comput., 2023, doi: 10.1109/TDSC.2023.3236355.</w:t>
-      </w:r>
-    </w:p>
-    <w:p>
-      <w:pPr>
-        <w:pStyle w:val="Ref"/>
-      </w:pPr>
-      <w:r>
-        <w:t xml:space="preserve">[15] </w:t>
-      </w:r>
-      <w:r>
-        <w:t xml:space="preserve">M. E. Aminanto, R. Choi, H. C. Tanuwidjaja, P. D. Yoo, and K. Kim, “Deep abstraction and weighted feature selection for Wi-Fi impersonation detection,” IEEE Trans. Inf. Forensics Security, vol. 13, 2018, doi: 10.1109/TIFS.2017.2762828.</w:t>
-      </w:r>
-    </w:p>
-    <w:p>
-      <w:pPr>
-        <w:pStyle w:val="Ref"/>
-      </w:pPr>
-      <w:r>
-        <w:t xml:space="preserve">[16] </w:t>
-      </w:r>
-      <w:r>
-        <w:t xml:space="preserve">S. M. Kasongo and Y. Sun, “A deep learning method with filter based feature engineering for wireless intrusion detection system,” IEEE Access, vol. 7, 2019, doi: 10.1109/ACCESS.2019.2905633.</w:t>
-      </w:r>
-    </w:p>
-    <w:p>
-      <w:pPr>
-        <w:pStyle w:val="Ref"/>
-      </w:pPr>
-      <w:r>
-        <w:t xml:space="preserve">[17] </w:t>
-      </w:r>
-      <w:r>
-        <w:t xml:space="preserve">J. Ran, Y. Ji, and B. Tang, “A semi-supervised learning approach to IEEE 802.11 network anomaly detection,” in Proc. IEEE Veh. Technol. Conf. (VTC-Spring), 2019, doi: 10.1109/VTCSpring.2019.8746576.</w:t>
-      </w:r>
-    </w:p>
-    <w:p>
-      <w:pPr>
-        <w:pStyle w:val="Ref"/>
-      </w:pPr>
-      <w:r>
-        <w:t xml:space="preserve">[18] </w:t>
-      </w:r>
-      <w:r>
-        <w:t xml:space="preserve">S. Solpan, H. Gündüz, K. Küçük, and F. Özyurt, “A hybrid feature fusion approach for multiclass Wi-Fi intrusion detection using classical machine learning,” Int. J. Inf. Secur., 2026, doi: 10.1007/s10207-026-01224-2.</w:t>
-      </w:r>
-    </w:p>
-    <w:p>
-      <w:pPr>
-        <w:pStyle w:val="Ref"/>
-      </w:pPr>
-      <w:r>
-        <w:t xml:space="preserve">[19] </w:t>
-      </w:r>
-      <w:r>
-        <w:t xml:space="preserve">S. Solpan, H. Gündüz, and K. Küçük, “Wi-Fi network intrusion detection: Enhanced with feature extraction and machine learning algorithms,” in Proc. 8th Int. Artif. Intell. Data Process. Symp. (IDAP), 2024, doi: 10.1109/IDAP64064.2024.10710685.</w:t>
-      </w:r>
-    </w:p>
-    <w:p>
-      <w:pPr>
-        <w:pStyle w:val="Ref"/>
-      </w:pPr>
-      <w:r>
-        <w:t xml:space="preserve">[20] </w:t>
-      </w:r>
-      <w:r>
-        <w:t xml:space="preserve">H. Jiang, Y. Yan, and X. Li, “Temporal context-enhanced wireless intrusion detection: Boosting recall for hard-to-detect attacks,” in Proc. IEEE Int. Conf. Blockchain Technol. Inf. Secur. (ICBCTIS), 2025, doi: 10.1109/ICBCTIS66509.2025.11387671.</w:t>
-      </w:r>
-    </w:p>
-    <w:p>
-      <w:pPr>
-        <w:pStyle w:val="Ref"/>
-      </w:pPr>
-      <w:r>
-        <w:t xml:space="preserve">[21] </w:t>
-      </w:r>
-      <w:r>
-        <w:t xml:space="preserve">M. Thankappan, H. Rifà-Pous, and C. Garrigues, “A signature-based wireless intrusion detection system framework for multi-channel man-in-the-middle attacks against protected Wi-Fi networks,” IEEE Access, 2024, doi: 10.1109/ACCESS.2024.3362803.</w:t>
-      </w:r>
-    </w:p>
-    <w:p>
-      <w:pPr>
-        <w:pStyle w:val="Ref"/>
-      </w:pPr>
-      <w:r>
-        <w:t xml:space="preserve">[22] </w:t>
-      </w:r>
-      <w:r>
-        <w:t xml:space="preserve">S. M. Trisha, S. Islam, and M. Hossen, “Performance evaluation of deep learning techniques for wireless intrusion detection system: A comparative feature selection approach,” in Proc. 27th Int. Conf. Comput. Inf. Technol. (ICCIT), 2024, doi: 10.1109/ICCIT64611.2024.11022476.</w:t>
-      </w:r>
-    </w:p>
-    <w:p>
-      <w:pPr>
-        <w:pStyle w:val="Ref"/>
-      </w:pPr>
-      <w:r>
-        <w:t xml:space="preserve">[23] </w:t>
-      </w:r>
-      <w:r>
-        <w:t xml:space="preserve">C. Hamroun, A. Fladenmuller, M. Pariente, and G. Pujolle, “Enriching the assessment of neural network-based wireless intrusion detection systems: A case study on Wi-Fi networks,” in Proc. Cyber Secur. Netw. Conf. (CSNet), 2025, doi: 10.1109/CSNet67572.2025.11288215.</w:t>
-      </w:r>
-    </w:p>
-    <w:p>
-      <w:pPr>
-        <w:pStyle w:val="Ref"/>
-      </w:pPr>
-      <w:r>
-        <w:t xml:space="preserve">[24] </w:t>
-      </w:r>
-      <w:r>
-        <w:t xml:space="preserve">P. Phalaagae, A. M. Zungeru, A. Yahya, B. Sigweni, and S. Rajalakshmi, “A hybrid CNN-LSTM model with attention mechanism for improved intrusion detection in wireless IoT sensor networks,” IEEE Access, 2025, doi: 10.1109/ACCESS.2025.3555861.</w:t>
-      </w:r>
-    </w:p>
-    <w:p>
-      <w:pPr>
-        <w:pStyle w:val="Ref"/>
-      </w:pPr>
-      <w:r>
-        <w:t xml:space="preserve">[25] </w:t>
-      </w:r>
-      <w:r>
-        <w:t xml:space="preserve">S. M. Lundberg and S.-I. Lee, “A unified approach to interpreting model predictions,” in Proc. Adv. Neural Inf. Process. Syst. (NeurIPS), 2017, pp. 4765–4774.</w:t>
-      </w:r>
-    </w:p>
-    <w:p>
-      <w:pPr>
-        <w:pStyle w:val="Ref"/>
-      </w:pPr>
-      <w:r>
-        <w:t xml:space="preserve">[26] </w:t>
-      </w:r>
-      <w:r>
-        <w:t xml:space="preserve">M. A. Ceylan, İ. F. Kılınçer, and F. Ertam, “CNN based cyber defense architecture for 802.11 networks,” Erciyes Univ. J. Inst. Sci. Technol., vol. 42, no. 2, pp. 581–599, 2026, doi: 10.65520/erciyesfen.1934250.</w:t>
-      </w:r>
-    </w:p>
-    <w:p>
-      <w:pPr>
-        <w:pStyle w:val="Ref"/>
-      </w:pPr>
-      <w:r>
-        <w:t xml:space="preserve">[27] </w:t>
-      </w:r>
-      <w:r>
-        <w:t xml:space="preserve">T. Chen and C. Guestrin, “XGBoost: A scalable tree boosting system,” in Proc. 22nd ACM SIGKDD Int. Conf. Knowl. Discovery Data Mining, 2016, pp. 785–794.</w:t>
-      </w:r>
-    </w:p>
-    <w:p>
-      <w:pPr>
-        <w:pStyle w:val="Ref"/>
-      </w:pPr>
-      <w:r>
-        <w:t xml:space="preserve">[28] </w:t>
-      </w:r>
-      <w:r>
-        <w:t xml:space="preserve">G. Ke et al., “LightGBM: A highly efficient gradient boosting decision tree,” in Proc. NeurIPS, 2017, pp. 3146–3154.</w:t>
-      </w:r>
-    </w:p>
-    <w:p>
-      <w:pPr>
-        <w:pStyle w:val="Ref"/>
-      </w:pPr>
-      <w:r>
-        <w:t xml:space="preserve">[29] </w:t>
-      </w:r>
-      <w:r>
-        <w:t xml:space="preserve">F. Pedregosa et al., “Scikit-learn: Machine learning in Python,” J. Mach. Learn. Res., vol. 12, pp. 2825–2830, 2011.</w:t>
-      </w:r>
-    </w:p>
-    <w:p>
-      <w:pPr>
-        <w:pStyle w:val="Ref"/>
-      </w:pPr>
-      <w:r>
-        <w:t xml:space="preserve">[30] </w:t>
-      </w:r>
-      <w:r>
-        <w:t xml:space="preserve">A. Vaswani et al., “Attention is all you need,” in Proc. NeurIPS, 2017, pp. 5998–6008.</w:t>
-      </w:r>
-    </w:p>
-    <w:p>
-      <w:pPr>
-        <w:pStyle w:val="Ref"/>
-      </w:pPr>
-      <w:r>
-        <w:t xml:space="preserve">[31] </w:t>
-      </w:r>
-      <w:r>
-        <w:t xml:space="preserve">F. T. Liu, K. M. Ting, and Z.-H. Zhou, “Isolation forest,” in Proc. 8th IEEE Int. Conf. Data Mining (ICDM), 2008, pp. 413–422.</w:t>
-      </w:r>
-    </w:p>
-    <w:p>
-      <w:pPr>
-        <w:pStyle w:val="Ref"/>
-      </w:pPr>
-      <w:r>
-        <w:t xml:space="preserve">[32] </w:t>
-      </w:r>
-      <w:r>
-        <w:t xml:space="preserve">D. P. Kingma and M. Welling, “Auto-encoding variational Bayes,” in Proc. Int. Conf. Learn. Representations (ICLR), 2014.</w:t>
-      </w:r>
-    </w:p>
-    <w:p>
-      <w:pPr>
-        <w:pStyle w:val="Ref"/>
-      </w:pPr>
-      <w:r>
-        <w:t xml:space="preserve">[33] </w:t>
-      </w:r>
-      <w:r>
-        <w:t xml:space="preserve">L. Ruff et al., “Deep one-class classification,” in Proc. 35th Int. Conf. Mach. Learn. (ICML), 2018, pp. 4393–4402.</w:t>
       </w:r>
     </w:p>
     <w:p>
@@ -10038,9 +9928,9 @@
     </w:tbl>
     <w:p>
       <w:r>
-        <w:t>APPENDIX B. HYBRID CNN+TRANSFORMER (SUPPLEMENTARY)</w:t>
+        <w:t>APPENDIX B. HYBRID CNN+TRANSFORMER — COMPLEMENTARY COMPARISON ONLY</w:t>
         <w:br/>
-        <w:t>The hybrid model is reported separately because deep training is evaluated on the stratified 75/25 hold-out (not 5-fold CV) for computational cost. On that split it reaches 0.929 macro-F1 and 0.974 accuracy — below XGBoost (0.976 macro-F1, 5-fold CV) and consistent with tabular-data expectations. A full 5-fold CV evaluation is left to future work; the released train_hybrid.py script reproduces the hold-out numbers.</w:t>
+        <w:t>The hybrid model is not part of the paper's primary contribution. It is included only as a complementary deep-learning baseline to show that, under the same leakage-controlled features, gradient-boosted trees remain preferable on this tabular 802.11 task. The hybrid is evaluated on a stratified 75/25 hold-out (not 5-fold CV) for computational cost; it reaches 0.929 macro-F1 and 0.974 accuracy — below XGBoost (0.976 macro-F1, 5-fold CV). Readers should treat Table 4 and the leakage analysis as the main empirical evidence; Appendix B is optional context. train_hybrid.py reproduces the hold-out numbers.</w:t>
       </w:r>
     </w:p>
     <w:sectPr>

</xml_diff>

<commit_message>
Complete verified volume/page details for refs [10],[31],[34] after reference authenticity check
</commit_message>
<xml_diff>
--- a/AWID3_Paper_IEEE_Access.docx
+++ b/AWID3_Paper_IEEE_Access.docx
@@ -8943,7 +8943,7 @@
     </w:p>
     <w:p>
       <w:r>
-        <w:t>[10] N. Khalid, S. Hina, K. S. Zaidi, T. Gaber, L. Speakman, and Z. Noor, “An investigation of feature reduction, transferability, and generalization in AWID datasets for secure Wi-Fi networks,” PLoS ONE, 2025.</w:t>
+        <w:t>[10] N. Khalid, S. Hina, K. S. Zaidi, T. Gaber, L. Speakman, and Z. Noor, “An investigation of feature reduction, transferability, and generalization in AWID datasets for secure Wi-Fi networks,” PLoS ONE, vol. 20, no. 1, art. e0306747, 2025, doi: 10.1371/journal.pone.0306747.</w:t>
       </w:r>
     </w:p>
     <w:p>
@@ -9048,7 +9048,7 @@
     </w:p>
     <w:p>
       <w:r>
-        <w:t>[31] M. Thankappan, H. Rifà-Pous, and C. Garrigues, “A signature-based wireless intrusion detection system framework for multi-channel man-in-the-middle attacks against protected Wi-Fi networks,” IEEE Access, 2024, doi: 10.1109/ACCESS.2024.3362803.</w:t>
+        <w:t>[31] M. Thankappan, H. Rifà-Pous, and C. Garrigues, “A signature-based wireless intrusion detection system framework for multi-channel man-in-the-middle attacks against protected Wi-Fi networks,” IEEE Access, vol. 12, pp. 23096–23121, 2024, doi: 10.1109/ACCESS.2024.3362803.</w:t>
       </w:r>
     </w:p>
     <w:p>
@@ -9063,7 +9063,7 @@
     </w:p>
     <w:p>
       <w:r>
-        <w:t>[34] P. Phalaagae, A. M. Zungeru, A. Yahya, B. Sigweni, and S. Rajalakshmi, “A hybrid CNN-LSTM model with attention mechanism for improved intrusion detection in wireless IoT sensor networks,” IEEE Access, 2025, doi: 10.1109/ACCESS.2025.3555861.</w:t>
+        <w:t>[34] P. Phalaagae, A. M. Zungeru, A. Yahya, B. Sigweni, and S. Rajalakshmi, “A hybrid CNN-LSTM model with attention mechanism for improved intrusion detection in wireless IoT sensor networks,” IEEE Access, vol. 13, pp. 57322–57341, 2025, doi: 10.1109/ACCESS.2025.3555861.</w:t>
       </w:r>
     </w:p>
     <w:p>

</xml_diff>

<commit_message>
Fix accidental full-bold formatting: restore bold lead-in + normal body in 28 paragraphs, correct caption/heading styles
</commit_message>
<xml_diff>
--- a/AWID3_Paper_IEEE_Access.docx
+++ b/AWID3_Paper_IEEE_Access.docx
@@ -120,9 +120,15 @@
           <w:b/>
           <w:bCs/>
         </w:rPr>
-        <w:t>C1) Leakage measurement. Where prior AWID3 work at most guards against leakage implicitly, we measure it. Naive per-category sampling of the full 43 GB corpus yields about 1.00 macro-F1 across every model family, logistic regression included, and this survives a restriction to a cleaned 34-feature set — which isolates the cause as capture-environment leakage rather than a few identifying columns. Going beyond detection, we attribute the source: a leave-one-feature-group-out analysis (Figure 11) shows that radio-layer fields, not attack behaviour, carry most of the inflated signal.</w:t>
+        <w:t xml:space="preserve">C1) Leakage measurement. </w:t>
       </w:r>
       <w:r/>
+      <w:r>
+        <w:rPr>
+          <w:b w:val="0"/>
+        </w:rPr>
+        <w:t>Where prior AWID3 work at most guards against leakage implicitly, we measure it. Naive per-category sampling of the full 43 GB corpus yields about 1.00 macro-F1 across every model family, logistic regression included, and this survives a restriction to a cleaned 34-feature set — which isolates the cause as capture-environment leakage rather than a few identifying columns. Going beyond detection, we attribute the source: a leave-one-feature-group-out analysis (Figure 11) shows that radio-layer fields, not attack behaviour, carry most of the inflated signal.</w:t>
+      </w:r>
     </w:p>
     <w:p>
       <w:pPr>
@@ -133,9 +139,15 @@
           <w:b/>
           <w:bCs/>
         </w:rPr>
-        <w:t>C2) Leakage-controlled benchmark. On the author-curated subset with explicit identifier and temporal removal, we provide a reproducible fourteen-class benchmark of nine classical and boosting models (plus a complementary hybrid baseline in Appendix B), with cross-validated metrics, per-class analysis, deployment resource measurements, and inference latency.</w:t>
+        <w:t xml:space="preserve">C2) Leakage-controlled benchmark. </w:t>
       </w:r>
       <w:r/>
+      <w:r>
+        <w:rPr>
+          <w:b w:val="0"/>
+        </w:rPr>
+        <w:t>On the author-curated subset with explicit identifier and temporal removal, we provide a reproducible fourteen-class benchmark of nine classical and boosting models (plus a complementary hybrid baseline in Appendix B), with cross-validated metrics, per-class analysis, deployment resource measurements, and inference latency.</w:t>
+      </w:r>
     </w:p>
     <w:p>
       <w:pPr>
@@ -146,9 +158,15 @@
           <w:b/>
           <w:bCs/>
         </w:rPr>
-        <w:t>C3) Explainability. We attach SHAP reasoning reports to detections and check that the most influential features agree with domain knowledge — UDP ports for SSDP, channel and frame-control fields for KRACK.</w:t>
+        <w:t xml:space="preserve">C3) Explainability. </w:t>
       </w:r>
       <w:r/>
+      <w:r>
+        <w:rPr>
+          <w:b w:val="0"/>
+        </w:rPr>
+        <w:t>We attach SHAP reasoning reports to detections and check that the most influential features agree with domain knowledge — UDP ports for SSDP, channel and frame-control fields for KRACK.</w:t>
+      </w:r>
     </w:p>
     <w:p>
       <w:pPr>
@@ -159,9 +177,15 @@
           <w:b/>
           <w:bCs/>
         </w:rPr>
-        <w:t>C4) Unseen-attack detection. Five unsupervised detectors are trained on benign traffic only, with an honest per-attack breakdown that includes attacks which are intrinsically hard to catch as anomalies.</w:t>
+        <w:t xml:space="preserve">C4) Unseen-attack detection. </w:t>
       </w:r>
       <w:r/>
+      <w:r>
+        <w:rPr>
+          <w:b w:val="0"/>
+        </w:rPr>
+        <w:t>Five unsupervised detectors are trained on benign traffic only, with an honest per-attack breakdown that includes attacks which are intrinsically hard to catch as anomalies.</w:t>
+      </w:r>
     </w:p>
     <w:p>
       <w:pPr>
@@ -912,9 +936,15 @@
           <w:b/>
           <w:bCs/>
         </w:rPr>
-        <w:t>FIGURE 1. High-level detection path: capture, windowed feature extraction, model inference, and optional explanation/response.</w:t>
+        <w:t xml:space="preserve">FIGURE 1. </w:t>
       </w:r>
       <w:r/>
+      <w:r>
+        <w:rPr>
+          <w:b w:val="0"/>
+        </w:rPr>
+        <w:t>High-level detection path: capture, windowed feature extraction, model inference, and optional explanation/response.</w:t>
+      </w:r>
     </w:p>
     <w:p>
       <w:pPr>
@@ -2411,6 +2441,9 @@
       </w:r>
     </w:p>
     <w:p>
+      <w:pPr>
+        <w:pStyle w:val="H4"/>
+      </w:pPr>
       <w:r>
         <w:t>D. FROM RAW FRAMES TO 34 PER-FRAME FEATURES</w:t>
       </w:r>
@@ -3571,9 +3604,15 @@
           <w:b/>
           <w:bCs/>
         </w:rPr>
-        <w:t>TABLE 4. Leakage-controlled 14-class benchmark (5-fold CV, mean ± std), ranked by macro-F1. Latency: median of 1,000 single-row predict() calls (batch size = 1) after warmup. Best-model hold-out bootstrap 95% CI (1,000 resamples): macro-F1 [0.9658, 0.9793], ROC-AUC [0.9996, 0.9998]; support-weighted F1 = 0.985 (hold-out). Friedman test: χ²=60.8, p&lt;10⁻⁹; Nemenyi post-hoc in Figure 5.</w:t>
+        <w:t xml:space="preserve">TABLE 4. </w:t>
       </w:r>
       <w:r/>
+      <w:r>
+        <w:rPr>
+          <w:b w:val="0"/>
+        </w:rPr>
+        <w:t>Leakage-controlled 14-class benchmark (5-fold CV, mean ± std), ranked by macro-F1. Latency: median of 1,000 single-row predict() calls (batch size = 1) after warmup. Best-model hold-out bootstrap 95% CI (1,000 resamples): macro-F1 [0.9658, 0.9793], ROC-AUC [0.9996, 0.9998]; support-weighted F1 = 0.985 (hold-out). Friedman test: χ²=60.8, p&lt;10⁻⁹; Nemenyi post-hoc in Figure 5.</w:t>
+      </w:r>
     </w:p>
     <w:p>
       <w:r>
@@ -5625,9 +5664,15 @@
           <w:b/>
           <w:bCs/>
         </w:rPr>
-        <w:t>FIGURE 2. Row-normalized confusion matrix (XGBoost). The dominant error is Deauth against Disas.</w:t>
+        <w:t xml:space="preserve">FIGURE 2. </w:t>
       </w:r>
       <w:r/>
+      <w:r>
+        <w:rPr>
+          <w:b w:val="0"/>
+        </w:rPr>
+        <w:t>Row-normalized confusion matrix (XGBoost). The dominant error is Deauth against Disas.</w:t>
+      </w:r>
     </w:p>
     <w:p>
       <w:pPr>
@@ -5696,9 +5741,15 @@
           <w:b/>
           <w:bCs/>
         </w:rPr>
-        <w:t>FIGURE 3. Per-class F1. The smallest classes are hardest.</w:t>
+        <w:t xml:space="preserve">FIGURE 3. </w:t>
       </w:r>
       <w:r/>
+      <w:r>
+        <w:rPr>
+          <w:b w:val="0"/>
+        </w:rPr>
+        <w:t>Per-class F1. The smallest classes are hardest.</w:t>
+      </w:r>
     </w:p>
     <w:p>
       <w:pPr>
@@ -5755,9 +5806,15 @@
           <w:b/>
           <w:bCs/>
         </w:rPr>
-        <w:t>FIGURE 4. One-vs-rest ROC curves for the fourteen classes; the macro-average AUC is 0.9998 (CV); held-out bootstrap mean 0.9997.</w:t>
+        <w:t xml:space="preserve">FIGURE 4. </w:t>
       </w:r>
       <w:r/>
+      <w:r>
+        <w:rPr>
+          <w:b w:val="0"/>
+        </w:rPr>
+        <w:t>One-vs-rest ROC curves for the fourteen classes; the macro-average AUC is 0.9998 (CV); held-out bootstrap mean 0.9997.</w:t>
+      </w:r>
     </w:p>
     <w:p>
       <w:pPr>
@@ -5822,9 +5879,15 @@
           <w:b/>
           <w:bCs/>
         </w:rPr>
-        <w:t>FIGURE 5. Critical-difference diagram (Nemenyi post-hoc). Models joined by a bar are statistically indistinguishable; lower rank is better.</w:t>
+        <w:t xml:space="preserve">FIGURE 5. </w:t>
       </w:r>
       <w:r/>
+      <w:r>
+        <w:rPr>
+          <w:b w:val="0"/>
+        </w:rPr>
+        <w:t>Critical-difference diagram (Nemenyi post-hoc). Models joined by a bar are statistically indistinguishable; lower rank is better.</w:t>
+      </w:r>
     </w:p>
     <w:p>
       <w:pPr>
@@ -5897,9 +5960,15 @@
           <w:b/>
           <w:bCs/>
         </w:rPr>
-        <w:t>FIGURE 6. Correlation matrix of the 34 curated features; most pairs are weakly correlated.</w:t>
+        <w:t xml:space="preserve">FIGURE 6. </w:t>
       </w:r>
       <w:r/>
+      <w:r>
+        <w:rPr>
+          <w:b w:val="0"/>
+        </w:rPr>
+        <w:t>Correlation matrix of the 34 curated features; most pairs are weakly correlated.</w:t>
+      </w:r>
     </w:p>
     <w:p>
       <w:pPr>
@@ -5956,9 +6025,15 @@
           <w:b/>
           <w:bCs/>
         </w:rPr>
-        <w:t>FIGURE 7. Top-15 feature importance (XGBoost).</w:t>
+        <w:t xml:space="preserve">FIGURE 7. </w:t>
       </w:r>
       <w:r/>
+      <w:r>
+        <w:rPr>
+          <w:b w:val="0"/>
+        </w:rPr>
+        <w:t>Top-15 feature importance (XGBoost).</w:t>
+      </w:r>
     </w:p>
     <w:p>
       <w:pPr>
@@ -6015,9 +6090,15 @@
           <w:b/>
           <w:bCs/>
         </w:rPr>
-        <w:t>FIGURE 8. Macro-F1 against the number of top-ranked features; the plateau arrives by about twenty.</w:t>
+        <w:t xml:space="preserve">FIGURE 8. </w:t>
       </w:r>
       <w:r/>
+      <w:r>
+        <w:rPr>
+          <w:b w:val="0"/>
+        </w:rPr>
+        <w:t>Macro-F1 against the number of top-ranked features; the plateau arrives by about twenty.</w:t>
+      </w:r>
     </w:p>
     <w:p>
       <w:pPr>
@@ -6593,9 +6674,15 @@
           <w:b/>
           <w:bCs/>
         </w:rPr>
-        <w:t>FIGURE 9. t-SNE of the naive across-capture split (34 clean features): each class forms an isolated cluster - capture-environment leakage.</w:t>
+        <w:t xml:space="preserve">FIGURE 9. </w:t>
       </w:r>
       <w:r/>
+      <w:r>
+        <w:rPr>
+          <w:b w:val="0"/>
+        </w:rPr>
+        <w:t>t-SNE of the naive across-capture split (34 clean features): each class forms an isolated cluster - capture-environment leakage.</w:t>
+      </w:r>
     </w:p>
     <w:p>
       <w:pPr>
@@ -6652,9 +6739,15 @@
           <w:b/>
           <w:bCs/>
         </w:rPr>
-        <w:t>FIGURE 10. t-SNE of the curated same-capture split: the same classes overlap and fragment - the honest picture.</w:t>
+        <w:t xml:space="preserve">FIGURE 10. </w:t>
       </w:r>
       <w:r/>
+      <w:r>
+        <w:rPr>
+          <w:b w:val="0"/>
+        </w:rPr>
+        <w:t>t-SNE of the curated same-capture split: the same classes overlap and fragment - the honest picture.</w:t>
+      </w:r>
     </w:p>
     <w:p>
       <w:r>
@@ -6701,8 +6794,20 @@
       </w:r>
     </w:p>
     <w:p>
-      <w:r>
-        <w:t>FIGURE 11. Leave-one-feature-group-out macro-F1 on naive vs curated splits (LR, 3-fold CV).</w:t>
+      <w:pPr>
+        <w:pStyle w:val="FigCaption"/>
+      </w:pPr>
+      <w:r>
+        <w:rPr>
+          <w:b/>
+        </w:rPr>
+        <w:t xml:space="preserve">FIGURE 11. </w:t>
+      </w:r>
+      <w:r>
+        <w:rPr>
+          <w:b w:val="0"/>
+        </w:rPr>
+        <w:t>Leave-one-feature-group-out macro-F1 on naive vs curated splits (LR, 3-fold CV).</w:t>
       </w:r>
     </w:p>
     <w:p>
@@ -6742,9 +6847,15 @@
           <w:b/>
           <w:bCs/>
         </w:rPr>
-        <w:t>TABLE 6. Unseen-attack detection (trained on benign traffic only).</w:t>
+        <w:t xml:space="preserve">TABLE 6. </w:t>
       </w:r>
       <w:r/>
+      <w:r>
+        <w:rPr>
+          <w:b w:val="0"/>
+        </w:rPr>
+        <w:t>Unseen-attack detection (trained on benign traffic only).</w:t>
+      </w:r>
     </w:p>
     <w:tbl>
       <w:tblPr>
@@ -7765,9 +7876,15 @@
           <w:b/>
           <w:bCs/>
         </w:rPr>
-        <w:t>FIGURE 12. SHAP beeswarm for the attack-versus-benign decision (top 15 features); colour is feature value, position is push toward attack.</w:t>
+        <w:t xml:space="preserve">FIGURE 12. </w:t>
       </w:r>
       <w:r/>
+      <w:r>
+        <w:rPr>
+          <w:b w:val="0"/>
+        </w:rPr>
+        <w:t>SHAP beeswarm for the attack-versus-benign decision (top 15 features); colour is feature value, position is push toward attack.</w:t>
+      </w:r>
     </w:p>
     <w:p>
       <w:pPr>
@@ -7809,8 +7926,20 @@
       </w:r>
     </w:p>
     <w:p>
-      <w:r>
-        <w:t>FIGURE 13. Local SHAP explanation — Normal traffic.</w:t>
+      <w:pPr>
+        <w:pStyle w:val="FigCaption"/>
+      </w:pPr>
+      <w:r>
+        <w:rPr>
+          <w:b/>
+        </w:rPr>
+        <w:t xml:space="preserve">FIGURE 13. </w:t>
+      </w:r>
+      <w:r>
+        <w:rPr>
+          <w:b w:val="0"/>
+        </w:rPr>
+        <w:t>Local SHAP explanation — Normal traffic.</w:t>
       </w:r>
     </w:p>
     <w:p>
@@ -7853,8 +7982,20 @@
       </w:r>
     </w:p>
     <w:p>
-      <w:r>
-        <w:t>FIGURE 14. Local SHAP explanation — Krack.</w:t>
+      <w:pPr>
+        <w:pStyle w:val="FigCaption"/>
+      </w:pPr>
+      <w:r>
+        <w:rPr>
+          <w:b/>
+        </w:rPr>
+        <w:t xml:space="preserve">FIGURE 14. </w:t>
+      </w:r>
+      <w:r>
+        <w:rPr>
+          <w:b w:val="0"/>
+        </w:rPr>
+        <w:t>Local SHAP explanation — Krack.</w:t>
       </w:r>
     </w:p>
     <w:p>
@@ -7897,8 +8038,20 @@
       </w:r>
     </w:p>
     <w:p>
-      <w:r>
-        <w:t>FIGURE 15. Local SHAP explanation — Deauth.</w:t>
+      <w:pPr>
+        <w:pStyle w:val="FigCaption"/>
+      </w:pPr>
+      <w:r>
+        <w:rPr>
+          <w:b/>
+        </w:rPr>
+        <w:t xml:space="preserve">FIGURE 15. </w:t>
+      </w:r>
+      <w:r>
+        <w:rPr>
+          <w:b w:val="0"/>
+        </w:rPr>
+        <w:t>Local SHAP explanation — Deauth.</w:t>
       </w:r>
     </w:p>
     <w:p>
@@ -7972,9 +8125,15 @@
           <w:b/>
           <w:bCs/>
         </w:rPr>
-        <w:t>FIGURE 16. Per-stage CPU latency (log scale): feature extraction over a 40-frame window dominates; classification is negligible.</w:t>
+        <w:t xml:space="preserve">FIGURE 16. </w:t>
       </w:r>
       <w:r/>
+      <w:r>
+        <w:rPr>
+          <w:b w:val="0"/>
+        </w:rPr>
+        <w:t>Per-stage CPU latency (log scale): feature extraction over a 40-frame window dominates; classification is negligible.</w:t>
+      </w:r>
     </w:p>
     <w:p>
       <w:pPr>
@@ -8042,9 +8201,15 @@
           <w:b/>
           <w:bCs/>
         </w:rPr>
-        <w:t>TABLE 7. Pipeline portability on wired flow corpora (stratified CV). Not a wireless generalisation claim.</w:t>
+        <w:t xml:space="preserve">TABLE 7. </w:t>
       </w:r>
       <w:r/>
+      <w:r>
+        <w:rPr>
+          <w:b w:val="0"/>
+        </w:rPr>
+        <w:t>Pipeline portability on wired flow corpora (stratified CV). Not a wireless generalisation claim.</w:t>
+      </w:r>
     </w:p>
     <w:tbl>
       <w:tblPr>
@@ -8791,9 +8956,15 @@
           <w:b/>
           <w:bCs/>
         </w:rPr>
-        <w:t>Evaluation scope. The wireless evaluation rests on a single corpus, AWID3, and its curated subset, though controlled for leakage, is one testbed. Section VII-B shows the pipeline runs on wired flow datasets as a portability check, but cross-wireless-dataset validation remains the highest-priority extension: AWID2 would directly test whether capture-environment leakage generalises beyond AWID3, but was not available for this study; live traffic validation is likewise future work.</w:t>
+        <w:t xml:space="preserve">Evaluation scope. </w:t>
       </w:r>
       <w:r/>
+      <w:r>
+        <w:rPr>
+          <w:b w:val="0"/>
+        </w:rPr>
+        <w:t>The wireless evaluation rests on a single corpus, AWID3, and its curated subset, though controlled for leakage, is one testbed. Section VII-B shows the pipeline runs on wired flow datasets as a portability check, but cross-wireless-dataset validation remains the highest-priority extension: AWID2 would directly test whether capture-environment leakage generalises beyond AWID3, but was not available for this study; live traffic validation is likewise future work.</w:t>
+      </w:r>
     </w:p>
     <w:p>
       <w:pPr>
@@ -8804,9 +8975,15 @@
           <w:b/>
           <w:bCs/>
         </w:rPr>
-        <w:t>Class imbalance. Several attack classes are small, with tens to a few hundred samples, which limits confidence in their per-class metrics. We therefore lead with macro-averaged F1, report bootstrap confidence intervals (Section VI), and use stratified folds that keep every class present in each partition; even so, per-class scores for the smallest categories (SQL_Injection, RogueAP) should be read as indicative, and larger same-capture samples are needed to tighten them.</w:t>
+        <w:t xml:space="preserve">Class imbalance. </w:t>
       </w:r>
       <w:r/>
+      <w:r>
+        <w:rPr>
+          <w:b w:val="0"/>
+        </w:rPr>
+        <w:t>Several attack classes are small, with tens to a few hundred samples, which limits confidence in their per-class metrics. We therefore lead with macro-averaged F1, report bootstrap confidence intervals (Section VI), and use stratified folds that keep every class present in each partition; even so, per-class scores for the smallest categories (SQL_Injection, RogueAP) should be read as indicative, and larger same-capture samples are needed to tighten them.</w:t>
+      </w:r>
     </w:p>
     <w:p>
       <w:pPr>
@@ -8817,9 +8994,15 @@
           <w:b/>
           <w:bCs/>
         </w:rPr>
-        <w:t>Hardware. Experiments are CPU-only and were not GPU-tuned. The hybrid deep model trails boosted trees on this tabular task (Appendix B), a known pattern for structured 802.11 features.</w:t>
+        <w:t xml:space="preserve">Hardware. </w:t>
       </w:r>
       <w:r/>
+      <w:r>
+        <w:rPr>
+          <w:b w:val="0"/>
+        </w:rPr>
+        <w:t>Experiments are CPU-only and were not GPU-tuned. The hybrid deep model trails boosted trees on this tabular task (Appendix B), a known pattern for structured 802.11 features.</w:t>
+      </w:r>
     </w:p>
     <w:p>
       <w:pPr>
@@ -8830,9 +9013,15 @@
           <w:b/>
           <w:bCs/>
         </w:rPr>
-        <w:t>Full-archive protocol. A same-capture sampling of the full archive — which would exploit its scale without leakage — is identified but not implemented here; it is the natural way to use the corpus scale without reintroducing leakage and is a priority extension alongside cross-wireless-dataset validation. It is deferred here for a practical reason: same-capture sampling across the full 43 GB archive is memory- and compute-intensive, whereas the curated subset already isolates the leakage effect cleanly. We plan to release a larger same-capture build of the full corpus, with the same scripted policy, as a follow-up artifact.</w:t>
+        <w:t xml:space="preserve">Full-archive protocol. </w:t>
       </w:r>
       <w:r/>
+      <w:r>
+        <w:rPr>
+          <w:b w:val="0"/>
+        </w:rPr>
+        <w:t>A same-capture sampling of the full archive — which would exploit its scale without leakage — is identified but not implemented here; it is the natural way to use the corpus scale without reintroducing leakage and is a priority extension alongside cross-wireless-dataset validation. It is deferred here for a practical reason: same-capture sampling across the full 43 GB archive is memory- and compute-intensive, whereas the curated subset already isolates the leakage effect cleanly. We plan to release a larger same-capture build of the full corpus, with the same scripted policy, as a follow-up artifact.</w:t>
+      </w:r>
     </w:p>
     <w:p>
       <w:pPr>
@@ -9142,8 +9331,20 @@
       </w:r>
     </w:p>
     <w:p>
-      <w:r>
-        <w:t>TABLE A1. Thirty-four leakage-controlled AWID3 per-frame features.</w:t>
+      <w:pPr>
+        <w:pStyle w:val="TableCaption"/>
+      </w:pPr>
+      <w:r>
+        <w:rPr>
+          <w:b/>
+        </w:rPr>
+        <w:t xml:space="preserve">TABLE A1. </w:t>
+      </w:r>
+      <w:r>
+        <w:rPr>
+          <w:b w:val="0"/>
+        </w:rPr>
+        <w:t>Thirty-four leakage-controlled AWID3 per-frame features.</w:t>
       </w:r>
     </w:p>
     <w:tbl>

</xml_diff>